<commit_message>
docs(standardization): reconstruccion y estandarizacion integral de los 9 documentos tecnicos bajo norma UTP e IEEE
</commit_message>
<xml_diff>
--- a/docs/01_Ficha_Identificacion.docx
+++ b/docs/01_Ficha_Identificacion.docx
@@ -4,33 +4,86 @@
   <w:body>
     <w:p>
       <w:pPr>
-        <w:spacing w:after="240"/>
+        <w:spacing w:before="320" w:after="120"/>
       </w:pPr>
       <w:r>
         <w:rPr>
+          <w:rFonts w:ascii="Calibri" w:hAnsi="Calibri"/>
           <w:b/>
           <w:color w:val="0F172A"/>
           <w:sz w:val="36"/>
         </w:rPr>
-        <w:t>Ficha de Identificacion y Mapeo Inicial - Leofit</w:t>
+        <w:t>UNIVERSIDAD TECNOLÓGICA DEL PERÚ</w:t>
       </w:r>
     </w:p>
     <w:p>
       <w:pPr>
-        <w:pStyle w:val="Heading2"/>
-        <w:spacing w:before="200" w:after="80"/>
+        <w:spacing w:before="240" w:after="80"/>
       </w:pPr>
       <w:r>
-        <w:t>Ficha de Identificación y Mapeo Inicial de Empresa y Problema (UTP)</w:t>
+        <w:rPr>
+          <w:rFonts w:ascii="Calibri" w:hAnsi="Calibri"/>
+          <w:b/>
+          <w:color w:val="F97316"/>
+          <w:sz w:val="28"/>
+        </w:rPr>
+        <w:t>FACULTAD DE INGENIERÍA DE SISTEMAS E INFORMÁTICA</w:t>
       </w:r>
     </w:p>
     <w:p>
       <w:pPr>
-        <w:pStyle w:val="Heading3"/>
-        <w:spacing w:before="160" w:after="60"/>
+        <w:spacing w:before="160" w:after="40"/>
       </w:pPr>
       <w:r>
-        <w:t>1. DATOS DEL EQUIPO (Grupo 01)</w:t>
+        <w:rPr>
+          <w:rFonts w:ascii="Calibri" w:hAnsi="Calibri"/>
+          <w:b/>
+          <w:color w:val="1E293B"/>
+          <w:sz w:val="24"/>
+        </w:rPr>
+        <w:t>CURSO INTEGRADOR II: SOFTWARE (100000S12F)</w:t>
+      </w:r>
+    </w:p>
+    <w:p>
+      <w:pPr>
+        <w:spacing w:before="320" w:after="120"/>
+      </w:pPr>
+      <w:r>
+        <w:rPr>
+          <w:rFonts w:ascii="Calibri" w:hAnsi="Calibri"/>
+          <w:b/>
+          <w:color w:val="0F172A"/>
+          <w:sz w:val="36"/>
+        </w:rPr>
+        <w:t>FICHA DE IDENTIFICACIÓN Y MAPEO INICIAL DE EMPRESA Y PROBLEMA (SEMANA 1)</w:t>
+      </w:r>
+    </w:p>
+    <w:p>
+      <w:pPr>
+        <w:spacing w:before="240" w:after="80"/>
+      </w:pPr>
+      <w:r>
+        <w:rPr>
+          <w:rFonts w:ascii="Calibri" w:hAnsi="Calibri"/>
+          <w:b/>
+          <w:color w:val="F97316"/>
+          <w:sz w:val="28"/>
+        </w:rPr>
+        <w:t>PROYECTO: SISTEMA WEB PWA DE GESTIÓN Y TOMA DE PEDIDOS MULTICANAL PARA LEOFIT</w:t>
+      </w:r>
+    </w:p>
+    <w:p>
+      <w:pPr>
+        <w:spacing w:before="160" w:after="40"/>
+      </w:pPr>
+      <w:r>
+        <w:rPr>
+          <w:rFonts w:ascii="Calibri" w:hAnsi="Calibri"/>
+          <w:b/>
+          <w:color w:val="1E293B"/>
+          <w:sz w:val="24"/>
+        </w:rPr>
+        <w:t>1. DATOS DEL EQUIPO DE TRABAJO (GRUPO 01)</w:t>
       </w:r>
     </w:p>
     <w:tbl>
@@ -40,20 +93,22 @@
         <w:tblLook w:firstColumn="1" w:firstRow="1" w:lastColumn="0" w:lastRow="0" w:noHBand="0" w:noVBand="1" w:val="04A0"/>
       </w:tblPr>
       <w:tblGrid>
-        <w:gridCol w:w="2880"/>
-        <w:gridCol w:w="2880"/>
-        <w:gridCol w:w="2880"/>
+        <w:gridCol w:w="2340"/>
+        <w:gridCol w:w="2340"/>
+        <w:gridCol w:w="2340"/>
+        <w:gridCol w:w="2340"/>
       </w:tblGrid>
       <w:tr>
         <w:tc>
           <w:tcPr>
-            <w:tcW w:type="dxa" w:w="2880"/>
+            <w:tcW w:type="dxa" w:w="2340"/>
+            <w:shd w:fill="0F172A"/>
           </w:tcPr>
           <w:p>
             <w:r>
               <w:rPr>
                 <w:b/>
-                <w:sz w:val="18"/>
+                <w:color w:val="FFFFFF"/>
               </w:rPr>
               <w:t>N°</w:t>
             </w:r>
@@ -61,13 +116,14 @@
         </w:tc>
         <w:tc>
           <w:tcPr>
-            <w:tcW w:type="dxa" w:w="2880"/>
+            <w:tcW w:type="dxa" w:w="2340"/>
+            <w:shd w:fill="0F172A"/>
           </w:tcPr>
           <w:p>
             <w:r>
               <w:rPr>
                 <w:b/>
-                <w:sz w:val="18"/>
+                <w:color w:val="FFFFFF"/>
               </w:rPr>
               <w:t>Apellidos y Nombres</w:t>
             </w:r>
@@ -75,15 +131,31 @@
         </w:tc>
         <w:tc>
           <w:tcPr>
-            <w:tcW w:type="dxa" w:w="2880"/>
+            <w:tcW w:type="dxa" w:w="2340"/>
+            <w:shd w:fill="0F172A"/>
           </w:tcPr>
           <w:p>
             <w:r>
               <w:rPr>
                 <w:b/>
-                <w:sz w:val="18"/>
+                <w:color w:val="FFFFFF"/>
               </w:rPr>
-              <w:t>Responsabilidad Inicial</w:t>
+              <w:t>Rol en el Proyecto</w:t>
+            </w:r>
+          </w:p>
+        </w:tc>
+        <w:tc>
+          <w:tcPr>
+            <w:tcW w:type="dxa" w:w="2340"/>
+            <w:shd w:fill="0F172A"/>
+          </w:tcPr>
+          <w:p>
+            <w:r>
+              <w:rPr>
+                <w:b/>
+                <w:color w:val="FFFFFF"/>
+              </w:rPr>
+              <w:t>Responsabilidad Técnica Principal</w:t>
             </w:r>
           </w:p>
         </w:tc>
@@ -91,40 +163,45 @@
       <w:tr>
         <w:tc>
           <w:tcPr>
-            <w:tcW w:type="dxa" w:w="2880"/>
+            <w:tcW w:type="dxa" w:w="2340"/>
+            <w:shd w:fill="F8FAFC"/>
           </w:tcPr>
           <w:p>
             <w:r>
-              <w:rPr>
-                <w:sz w:val="18"/>
-              </w:rPr>
               <w:t>1</w:t>
             </w:r>
           </w:p>
         </w:tc>
         <w:tc>
           <w:tcPr>
-            <w:tcW w:type="dxa" w:w="2880"/>
+            <w:tcW w:type="dxa" w:w="2340"/>
+            <w:shd w:fill="F8FAFC"/>
           </w:tcPr>
           <w:p>
             <w:r>
-              <w:rPr>
-                <w:sz w:val="18"/>
-              </w:rPr>
-              <w:t>Cárdenas Fernández Víctor Leandro</w:t>
+              <w:t>**Loayza Rodriguez, Lady Luz**</w:t>
             </w:r>
           </w:p>
         </w:tc>
         <w:tc>
           <w:tcPr>
-            <w:tcW w:type="dxa" w:w="2880"/>
+            <w:tcW w:type="dxa" w:w="2340"/>
+            <w:shd w:fill="F8FAFC"/>
           </w:tcPr>
           <w:p>
             <w:r>
-              <w:rPr>
-                <w:sz w:val="18"/>
-              </w:rPr>
-              <w:t>Back-End / Base de Datos</w:t>
+              <w:t>Scrum Master</w:t>
+            </w:r>
+          </w:p>
+        </w:tc>
+        <w:tc>
+          <w:tcPr>
+            <w:tcW w:type="dxa" w:w="2340"/>
+            <w:shd w:fill="F8FAFC"/>
+          </w:tcPr>
+          <w:p>
+            <w:r>
+              <w:t>Coordinación general, facilitación ágil y diseño UX/UI.</w:t>
             </w:r>
           </w:p>
         </w:tc>
@@ -132,40 +209,41 @@
       <w:tr>
         <w:tc>
           <w:tcPr>
-            <w:tcW w:type="dxa" w:w="2880"/>
+            <w:tcW w:type="dxa" w:w="2340"/>
           </w:tcPr>
           <w:p>
             <w:r>
-              <w:rPr>
-                <w:sz w:val="18"/>
-              </w:rPr>
               <w:t>2</w:t>
             </w:r>
           </w:p>
         </w:tc>
         <w:tc>
           <w:tcPr>
-            <w:tcW w:type="dxa" w:w="2880"/>
+            <w:tcW w:type="dxa" w:w="2340"/>
           </w:tcPr>
           <w:p>
             <w:r>
-              <w:rPr>
-                <w:sz w:val="18"/>
-              </w:rPr>
-              <w:t>Dávila Morales Jim Alessandro</w:t>
+              <w:t>**Cárdenas Fernández, Víctor Leandro**</w:t>
             </w:r>
           </w:p>
         </w:tc>
         <w:tc>
           <w:tcPr>
-            <w:tcW w:type="dxa" w:w="2880"/>
+            <w:tcW w:type="dxa" w:w="2340"/>
           </w:tcPr>
           <w:p>
             <w:r>
-              <w:rPr>
-                <w:sz w:val="18"/>
-              </w:rPr>
-              <w:t>Calidad / Despliegue</w:t>
+              <w:t>Product Owner</w:t>
+            </w:r>
+          </w:p>
+        </w:tc>
+        <w:tc>
+          <w:tcPr>
+            <w:tcW w:type="dxa" w:w="2340"/>
+          </w:tcPr>
+          <w:p>
+            <w:r>
+              <w:t>Definición de requerimientos, arquitectura Back-End y Base de Datos.</w:t>
             </w:r>
           </w:p>
         </w:tc>
@@ -173,40 +251,45 @@
       <w:tr>
         <w:tc>
           <w:tcPr>
-            <w:tcW w:type="dxa" w:w="2880"/>
+            <w:tcW w:type="dxa" w:w="2340"/>
+            <w:shd w:fill="F8FAFC"/>
           </w:tcPr>
           <w:p>
             <w:r>
-              <w:rPr>
-                <w:sz w:val="18"/>
-              </w:rPr>
               <w:t>3</w:t>
             </w:r>
           </w:p>
         </w:tc>
         <w:tc>
           <w:tcPr>
-            <w:tcW w:type="dxa" w:w="2880"/>
+            <w:tcW w:type="dxa" w:w="2340"/>
+            <w:shd w:fill="F8FAFC"/>
           </w:tcPr>
           <w:p>
             <w:r>
-              <w:rPr>
-                <w:sz w:val="18"/>
-              </w:rPr>
-              <w:t>Roman Delgado Harley Anthony</w:t>
+              <w:t>**Roman Delgado, Harley Anthony**</w:t>
             </w:r>
           </w:p>
         </w:tc>
         <w:tc>
           <w:tcPr>
-            <w:tcW w:type="dxa" w:w="2880"/>
+            <w:tcW w:type="dxa" w:w="2340"/>
+            <w:shd w:fill="F8FAFC"/>
           </w:tcPr>
           <w:p>
             <w:r>
-              <w:rPr>
-                <w:sz w:val="18"/>
-              </w:rPr>
-              <w:t>UX / Front-End</w:t>
+              <w:t>Front-End Lead</w:t>
+            </w:r>
+          </w:p>
+        </w:tc>
+        <w:tc>
+          <w:tcPr>
+            <w:tcW w:type="dxa" w:w="2340"/>
+            <w:shd w:fill="F8FAFC"/>
+          </w:tcPr>
+          <w:p>
+            <w:r>
+              <w:t>Desarrollo de interfaz PWA, componentes React y optimización WPO.</w:t>
             </w:r>
           </w:p>
         </w:tc>
@@ -214,40 +297,41 @@
       <w:tr>
         <w:tc>
           <w:tcPr>
-            <w:tcW w:type="dxa" w:w="2880"/>
+            <w:tcW w:type="dxa" w:w="2340"/>
           </w:tcPr>
           <w:p>
             <w:r>
-              <w:rPr>
-                <w:sz w:val="18"/>
-              </w:rPr>
               <w:t>4</w:t>
             </w:r>
           </w:p>
         </w:tc>
         <w:tc>
           <w:tcPr>
-            <w:tcW w:type="dxa" w:w="2880"/>
+            <w:tcW w:type="dxa" w:w="2340"/>
           </w:tcPr>
           <w:p>
             <w:r>
-              <w:rPr>
-                <w:sz w:val="18"/>
-              </w:rPr>
-              <w:t>Loayza Rodriguez Lady Luz</w:t>
+              <w:t>**Dávila Morales, Jim Alessandro**</w:t>
             </w:r>
           </w:p>
         </w:tc>
         <w:tc>
           <w:tcPr>
-            <w:tcW w:type="dxa" w:w="2880"/>
+            <w:tcW w:type="dxa" w:w="2340"/>
           </w:tcPr>
           <w:p>
             <w:r>
-              <w:rPr>
-                <w:sz w:val="18"/>
-              </w:rPr>
-              <w:t>UX / Front-End</w:t>
+              <w:t>QA / DevOps</w:t>
+            </w:r>
+          </w:p>
+        </w:tc>
+        <w:tc>
+          <w:tcPr>
+            <w:tcW w:type="dxa" w:w="2340"/>
+          </w:tcPr>
+          <w:p>
+            <w:r>
+              <w:t>Automatización de pruebas unitarias, CI/CD y aseguramiento de calidad.</w:t>
             </w:r>
           </w:p>
         </w:tc>
@@ -255,40 +339,45 @@
       <w:tr>
         <w:tc>
           <w:tcPr>
-            <w:tcW w:type="dxa" w:w="2880"/>
+            <w:tcW w:type="dxa" w:w="2340"/>
+            <w:shd w:fill="F8FAFC"/>
           </w:tcPr>
           <w:p>
             <w:r>
-              <w:rPr>
-                <w:sz w:val="18"/>
-              </w:rPr>
               <w:t>5</w:t>
             </w:r>
           </w:p>
         </w:tc>
         <w:tc>
           <w:tcPr>
-            <w:tcW w:type="dxa" w:w="2880"/>
+            <w:tcW w:type="dxa" w:w="2340"/>
+            <w:shd w:fill="F8FAFC"/>
           </w:tcPr>
           <w:p>
             <w:r>
-              <w:rPr>
-                <w:sz w:val="18"/>
-              </w:rPr>
-              <w:t>Rojas Sanchez Daniel Enrique</w:t>
+              <w:t>**Rojas Sanchez, Daniel Enrique**</w:t>
             </w:r>
           </w:p>
         </w:tc>
         <w:tc>
           <w:tcPr>
-            <w:tcW w:type="dxa" w:w="2880"/>
+            <w:tcW w:type="dxa" w:w="2340"/>
+            <w:shd w:fill="F8FAFC"/>
           </w:tcPr>
           <w:p>
             <w:r>
-              <w:rPr>
-                <w:sz w:val="18"/>
-              </w:rPr>
-              <w:t>Gestión / Análisis</w:t>
+              <w:t>Analista de Negocio</w:t>
+            </w:r>
+          </w:p>
+        </w:tc>
+        <w:tc>
+          <w:tcPr>
+            <w:tcW w:type="dxa" w:w="2340"/>
+            <w:shd w:fill="F8FAFC"/>
+          </w:tcPr>
+          <w:p>
+            <w:r>
+              <w:t>Levantamiento de requisitos, modelado de procesos y documentación técnica.</w:t>
             </w:r>
           </w:p>
         </w:tc>
@@ -297,10 +386,15 @@
     <w:p/>
     <w:p>
       <w:pPr>
-        <w:pStyle w:val="Heading3"/>
-        <w:spacing w:before="160" w:after="60"/>
+        <w:spacing w:before="160" w:after="40"/>
       </w:pPr>
       <w:r>
+        <w:rPr>
+          <w:rFonts w:ascii="Calibri" w:hAnsi="Calibri"/>
+          <w:b/>
+          <w:color w:val="1E293B"/>
+          <w:sz w:val="24"/>
+        </w:rPr>
         <w:t>2. IDENTIFICACIÓN DE LA ORGANIZACIÓN</w:t>
       </w:r>
     </w:p>
@@ -310,7 +404,7 @@
         <w:spacing w:after="40"/>
       </w:pPr>
       <w:r>
-        <w:t>Nombre / Razón Social: Leofit</w:t>
+        <w:t>Nombre Comercial: LeoFit Indumentaria &amp; Nutrición Deportiva.</w:t>
       </w:r>
     </w:p>
     <w:p>
@@ -319,7 +413,7 @@
         <w:spacing w:after="40"/>
       </w:pPr>
       <w:r>
-        <w:t>Rubro / Actividad: Venta minorista de ropa deportiva (*e-commerce*)</w:t>
+        <w:t>Rubro Comercial: Comercialización minorista de indumentaria deportiva (conjuntos térmicos, lycras de compresión, camisetas dry-fit, fajas deportivas) y accesorios de entrenamiento.</w:t>
       </w:r>
     </w:p>
     <w:p>
@@ -328,7 +422,7 @@
         <w:spacing w:after="40"/>
       </w:pPr>
       <w:r>
-        <w:t>Sede / Ubicación: Negocio online (Lima, Perú)</w:t>
+        <w:t>Ubicación Geográfica: Lima Metropolitana, Perú.</w:t>
       </w:r>
     </w:p>
     <w:p>
@@ -337,7 +431,7 @@
         <w:spacing w:after="40"/>
       </w:pPr>
       <w:r>
-        <w:t>Área donde se observa el problema: Gestión de pedidos y atención al cliente. No existe un sistema centralizado para administrar los pedidos.</w:t>
+        <w:t>Modelo de Operación: Ventas directas al consumidor (B2C) en Lima y despachos a provincias mediante agencias de encomienda.</w:t>
       </w:r>
     </w:p>
     <w:p>
@@ -346,7 +440,21 @@
         <w:spacing w:after="40"/>
       </w:pPr>
       <w:r>
-        <w:t>Producto o Servicio Principal: Ropa deportiva para entrenamiento y gimnasio (camisetas técnicas, shorts, pantalones deportivos, licras y accesorios).</w:t>
+        <w:t>Justificación de la Selección: LeoFit es un emprendimiento comercial independiente en fase de expansión que gestiona sus ventas de forma reactiva y no estandarizada a través de redes sociales (Facebook y WhatsApp). Representa un caso de estudio real, accesible y de alta pertinencia para la implementación de una solución de software orientada a la eficiencia operativa.</w:t>
+      </w:r>
+    </w:p>
+    <w:p>
+      <w:pPr>
+        <w:spacing w:before="160" w:after="40"/>
+      </w:pPr>
+      <w:r>
+        <w:rPr>
+          <w:rFonts w:ascii="Calibri" w:hAnsi="Calibri"/>
+          <w:b/>
+          <w:color w:val="1E293B"/>
+          <w:sz w:val="24"/>
+        </w:rPr>
+        <w:t>3. CONTACTO Y EVIDENCIA DE ACCESO AL STAKEHOLDER</w:t>
       </w:r>
     </w:p>
     <w:p>
@@ -355,7 +463,7 @@
         <w:spacing w:after="40"/>
       </w:pPr>
       <w:r>
-        <w:t>Descripción breve de la organización: PYME familiar peruana enfocada en la confección y venta de indumentaria deportiva. Actualmente opera de manera exclusiva a través de redes sociales (Facebook) y mensajería instantánea (WhatsApp).</w:t>
+        <w:t>Representante y Contacto Principal: Víctor Raúl Cárdenas Ramírez.</w:t>
       </w:r>
     </w:p>
     <w:p>
@@ -364,24 +472,7 @@
         <w:spacing w:after="40"/>
       </w:pPr>
       <w:r>
-        <w:t>¿Por qué eligieron esta organización?</w:t>
-      </w:r>
-    </w:p>
-    <w:p>
-      <w:pPr>
-        <w:spacing w:after="80"/>
-      </w:pPr>
-      <w:r>
-        <w:t>Es un negocio familiar con alto potencial de crecimiento que busca profesionalizar su gestión operativa y expandir su alcance comercial. Al operar únicamente mediante un perfil de Facebook y un número de WhatsApp, la capacidad de respuesta se satura y se generan ineficiencias críticas. Representa un caso de estudio real, accesible y de impacto directo para el equipo.</w:t>
-      </w:r>
-    </w:p>
-    <w:p>
-      <w:pPr>
-        <w:pStyle w:val="Heading3"/>
-        <w:spacing w:before="160" w:after="60"/>
-      </w:pPr>
-      <w:r>
-        <w:t>3. CONTACTO Y EVIDENCIA DE ACCESO</w:t>
+        <w:t>Cargo: Fundador, Gerente General y Operador Principal.</w:t>
       </w:r>
     </w:p>
     <w:p>
@@ -390,7 +481,7 @@
         <w:spacing w:after="40"/>
       </w:pPr>
       <w:r>
-        <w:t>Nombre del contacto: Victor Raúl Cárdenas Ramírez</w:t>
+        <w:t>Disponibilidad y Compromiso: El representante ha suscrito actas de conformidad y se encuentra plenamente comprometido para participar en las sesiones semanales de Sprint Review y validación de prototipos.</w:t>
       </w:r>
     </w:p>
     <w:p>
@@ -399,7 +490,21 @@
         <w:spacing w:after="40"/>
       </w:pPr>
       <w:r>
-        <w:t>Cargo / Rol: Dueño y operador principal</w:t>
+        <w:t>Evidencias Disponibles: Registros históricos en cuadernos físicos de notas, capturas anonimizadas de conversaciones de WhatsApp comercial y catálogo fotográfico actual de prendas.</w:t>
+      </w:r>
+    </w:p>
+    <w:p>
+      <w:pPr>
+        <w:spacing w:before="160" w:after="40"/>
+      </w:pPr>
+      <w:r>
+        <w:rPr>
+          <w:rFonts w:ascii="Calibri" w:hAnsi="Calibri"/>
+          <w:b/>
+          <w:color w:val="1E293B"/>
+          <w:sz w:val="24"/>
+        </w:rPr>
+        <w:t>4. MAPEO INICIAL DEL PROCESO Y DEFINICIÓN DEL PROBLEMA</w:t>
       </w:r>
     </w:p>
     <w:p>
@@ -408,7 +513,7 @@
         <w:spacing w:after="40"/>
       </w:pPr>
       <w:r>
-        <w:t>Relación con el proceso: Ejecutor directo. Es la única persona que atiende consultas telefónicas, revisa mensajes, valida el stock manualmente, toma pedidos y coordina las entregas.</w:t>
+        <w:t>Proceso Crítico Seleccionado: Recepción, validación de existencias, registro y despacho de pedidos.</w:t>
       </w:r>
     </w:p>
     <w:p>
@@ -417,16 +522,7 @@
         <w:spacing w:after="40"/>
       </w:pPr>
       <w:r>
-        <w:t>Medio de contacto: [X] Presencial | [ ] Llamada | [ ] Meet/Zoom | [X] WhatsApp</w:t>
-      </w:r>
-    </w:p>
-    <w:p>
-      <w:pPr>
-        <w:pStyle w:val="ListBullet"/>
-        <w:spacing w:after="40"/>
-      </w:pPr>
-      <w:r>
-        <w:t>Fecha del primer contacto: 15/08/2026</w:t>
+        <w:t>Definición Formal del Problema:</w:t>
       </w:r>
     </w:p>
     <w:p>
@@ -434,196 +530,21 @@
         <w:spacing w:after="80"/>
       </w:pPr>
       <w:r>
-        <w:t>#### Evidencias disponibles:</w:t>
+        <w:t>"La gestión manual, descentralizada y reactiva de los pedidos comerciales a través de canales de mensajería informal (WhatsApp y llamadas telefónicas) en LeoFit ocasiona cuellos de botella operativos, demoras de hasta 25 minutos en la atención por cliente, quiebres de inventario no advertidos y errores en las direcciones de despacho, impactando negativamente en la rentabilidad y en la satisfacción del cliente."</w:t>
       </w:r>
     </w:p>
     <w:p>
       <w:pPr>
-        <w:pStyle w:val="ListBullet"/>
-        <w:spacing w:after="40"/>
+        <w:spacing w:before="160" w:after="40"/>
       </w:pPr>
       <w:r>
-        <w:t>[X] Captura de conversación o chat de WhatsApp (ubicada en evidence/semana_1/Evidencia_Contacto.png).</w:t>
-      </w:r>
-    </w:p>
-    <w:p>
-      <w:pPr>
-        <w:pStyle w:val="ListBullet"/>
-        <w:spacing w:after="40"/>
-      </w:pPr>
-      <w:r>
-        <w:t>[X] Minuta / resumen de entrevista inicial (ubicada en docs/03_Acta_Reunion_1.md).</w:t>
-      </w:r>
-    </w:p>
-    <w:p>
-      <w:pPr>
-        <w:pStyle w:val="ListBullet"/>
-        <w:spacing w:after="40"/>
-      </w:pPr>
-      <w:r>
-        <w:t>[X] Documento original de mapeo UTP en PDF (evidence/semana_1/Ficha_Mapeo_Original.pdf).</w:t>
-      </w:r>
-    </w:p>
-    <w:p>
-      <w:pPr>
-        <w:pStyle w:val="ListBullet"/>
-        <w:spacing w:after="40"/>
-      </w:pPr>
-      <w:r>
-        <w:t>[X] Confirmación del problema por parte del contacto.</w:t>
-      </w:r>
-    </w:p>
-    <w:p>
-      <w:pPr>
-        <w:spacing w:after="80"/>
-      </w:pPr>
-      <w:r>
-        <w:t>#### Guía de la primera conversación con el dueño:</w:t>
-      </w:r>
-    </w:p>
-    <w:p>
-      <w:pPr>
-        <w:spacing w:after="80"/>
-      </w:pPr>
-      <w:r>
-        <w:t>1. ¿Qué proceso genera actualmente más demoras, errores o retrabajo?</w:t>
-      </w:r>
-    </w:p>
-    <w:p>
-      <w:pPr>
-        <w:spacing w:after="80"/>
-        <w:ind w:left="576"/>
-      </w:pPr>
-      <w:r>
-        <w:t>"*"Contestar llamadas telefónicas y mensajes de WhatsApp. Al ser un proceso virtual manual y no estandarizado, genera demoras en la respuesta, desconfianza en los clientes y sobrecarga operativa."*"</w:t>
-      </w:r>
-    </w:p>
-    <w:p>
-      <w:pPr>
-        <w:spacing w:after="80"/>
-      </w:pPr>
-      <w:r>
-        <w:t>2. ¿Cómo se realiza hoy ese proceso y con qué herramientas?</w:t>
-      </w:r>
-    </w:p>
-    <w:p>
-      <w:pPr>
-        <w:spacing w:after="80"/>
-        <w:ind w:left="576"/>
-      </w:pPr>
-      <w:r>
-        <w:t>"*"Se realiza de manera 100% manual y reactiva utilizando el celular personal, WhatsApp, llamadas directas y publicaciones en Facebook Marketplace."*"</w:t>
-      </w:r>
-    </w:p>
-    <w:p>
-      <w:pPr>
-        <w:spacing w:after="80"/>
-      </w:pPr>
-      <w:r>
-        <w:t>3. ¿Quiénes participan y quién es el principal afectado?</w:t>
-      </w:r>
-    </w:p>
-    <w:p>
-      <w:pPr>
-        <w:spacing w:after="80"/>
-        <w:ind w:left="576"/>
-      </w:pPr>
-      <w:r>
-        <w:t>"*"Participan Víctor Raúl (dueño) y los clientes. El afectado principal es Víctor por la sobrecarga y el estrés de perder ventas, y los clientes por la lentitud de respuesta."*"</w:t>
-      </w:r>
-    </w:p>
-    <w:p>
-      <w:pPr>
-        <w:spacing w:after="80"/>
-      </w:pPr>
-      <w:r>
-        <w:t>4. ¿Con qué frecuencia ocurre el problema?</w:t>
-      </w:r>
-    </w:p>
-    <w:p>
-      <w:pPr>
-        <w:spacing w:after="80"/>
-        <w:ind w:left="576"/>
-      </w:pPr>
-      <w:r>
-        <w:t>"*"Diariamente, intensificándose cada vez que se publican nuevos modelos o promociones."*"</w:t>
-      </w:r>
-    </w:p>
-    <w:p>
-      <w:pPr>
-        <w:spacing w:after="80"/>
-      </w:pPr>
-      <w:r>
-        <w:t>5. ¿Qué consecuencia genera?</w:t>
-      </w:r>
-    </w:p>
-    <w:p>
-      <w:pPr>
-        <w:spacing w:after="80"/>
-        <w:ind w:left="576"/>
-      </w:pPr>
-      <w:r>
-        <w:t>"*"Pérdida de tiempo, pérdida de clientes potenciales que desisten de comprar por demora, riesgo de error o pérdida de direcciones al anotar en libretas o notas de celular."*"</w:t>
-      </w:r>
-    </w:p>
-    <w:p>
-      <w:pPr>
-        <w:spacing w:after="80"/>
-      </w:pPr>
-      <w:r>
-        <w:t>6. ¿Qué evidencia puede compartir la organización?</w:t>
-      </w:r>
-    </w:p>
-    <w:p>
-      <w:pPr>
-        <w:spacing w:after="80"/>
-        <w:ind w:left="576"/>
-      </w:pPr>
-      <w:r>
-        <w:t>"*"Registros manuales de pedidos, capturas de chats y confirmación de volumen de consultas no atendidas a tiempo."*"</w:t>
-      </w:r>
-    </w:p>
-    <w:p>
-      <w:pPr>
-        <w:spacing w:after="80"/>
-      </w:pPr>
-      <w:r>
-        <w:t>7. ¿Qué resultado esperaría mejorar con una solución informática?</w:t>
-      </w:r>
-    </w:p>
-    <w:p>
-      <w:pPr>
-        <w:spacing w:after="80"/>
-        <w:ind w:left="576"/>
-      </w:pPr>
-      <w:r>
-        <w:t>"*"Ahorrar al menos 60% del tiempo en la gestión de pedidos, no perder pedidos, tener control claro del stock disponible y brindar seguimiento profesional al cliente."*"</w:t>
-      </w:r>
-    </w:p>
-    <w:p>
-      <w:pPr>
-        <w:spacing w:after="80"/>
-      </w:pPr>
-      <w:r>
-        <w:t>8. ¿Quién validará el prototipo o la solución?</w:t>
-      </w:r>
-    </w:p>
-    <w:p>
-      <w:pPr>
-        <w:spacing w:after="80"/>
-        <w:ind w:left="576"/>
-      </w:pPr>
-      <w:r>
-        <w:t>"*"Víctor Raúl Cárdenas Ramírez (dueño y usuario final)."*"</w:t>
-      </w:r>
-    </w:p>
-    <w:p>
-      <w:pPr>
-        <w:pStyle w:val="Heading3"/>
-        <w:spacing w:before="160" w:after="60"/>
-      </w:pPr>
-      <w:r>
-        <w:t>4. MAPEO INICIAL DEL NEGOCIO</w:t>
+        <w:rPr>
+          <w:rFonts w:ascii="Calibri" w:hAnsi="Calibri"/>
+          <w:b/>
+          <w:color w:val="1E293B"/>
+          <w:sz w:val="24"/>
+        </w:rPr>
+        <w:t>5. ACTORES Y MATRIZ DE NECESIDADES</w:t>
       </w:r>
     </w:p>
     <w:tbl>
@@ -633,35 +554,85 @@
         <w:tblLook w:firstColumn="1" w:firstRow="1" w:lastColumn="0" w:lastRow="0" w:noHBand="0" w:noVBand="1" w:val="04A0"/>
       </w:tblPr>
       <w:tblGrid>
-        <w:gridCol w:w="4320"/>
-        <w:gridCol w:w="4320"/>
+        <w:gridCol w:w="1872"/>
+        <w:gridCol w:w="1872"/>
+        <w:gridCol w:w="1872"/>
+        <w:gridCol w:w="1872"/>
+        <w:gridCol w:w="1872"/>
       </w:tblGrid>
       <w:tr>
         <w:tc>
           <w:tcPr>
-            <w:tcW w:type="dxa" w:w="4320"/>
+            <w:tcW w:type="dxa" w:w="1872"/>
+            <w:shd w:fill="0F172A"/>
           </w:tcPr>
           <w:p>
             <w:r>
               <w:rPr>
                 <w:b/>
-                <w:sz w:val="18"/>
+                <w:color w:val="FFFFFF"/>
               </w:rPr>
-              <w:t>Elemento</w:t>
+              <w:t>Actor / Usuario</w:t>
             </w:r>
           </w:p>
         </w:tc>
         <w:tc>
           <w:tcPr>
-            <w:tcW w:type="dxa" w:w="4320"/>
+            <w:tcW w:type="dxa" w:w="1872"/>
+            <w:shd w:fill="0F172A"/>
           </w:tcPr>
           <w:p>
             <w:r>
               <w:rPr>
                 <w:b/>
-                <w:sz w:val="18"/>
+                <w:color w:val="FFFFFF"/>
               </w:rPr>
-              <w:t>Descripción</w:t>
+              <w:t>Rol en el Negocio</w:t>
+            </w:r>
+          </w:p>
+        </w:tc>
+        <w:tc>
+          <w:tcPr>
+            <w:tcW w:type="dxa" w:w="1872"/>
+            <w:shd w:fill="0F172A"/>
+          </w:tcPr>
+          <w:p>
+            <w:r>
+              <w:rPr>
+                <w:b/>
+                <w:color w:val="FFFFFF"/>
+              </w:rPr>
+              <w:t>Necesidad Principal</w:t>
+            </w:r>
+          </w:p>
+        </w:tc>
+        <w:tc>
+          <w:tcPr>
+            <w:tcW w:type="dxa" w:w="1872"/>
+            <w:shd w:fill="0F172A"/>
+          </w:tcPr>
+          <w:p>
+            <w:r>
+              <w:rPr>
+                <w:b/>
+                <w:color w:val="FFFFFF"/>
+              </w:rPr>
+              <w:t>Dificultad Actual</w:t>
+            </w:r>
+          </w:p>
+        </w:tc>
+        <w:tc>
+          <w:tcPr>
+            <w:tcW w:type="dxa" w:w="1872"/>
+            <w:shd w:fill="0F172A"/>
+          </w:tcPr>
+          <w:p>
+            <w:r>
+              <w:rPr>
+                <w:b/>
+                <w:color w:val="FFFFFF"/>
+              </w:rPr>
+              <w:t>Validación Propuesta</w:t>
             </w:r>
           </w:p>
         </w:tc>
@@ -669,27 +640,56 @@
       <w:tr>
         <w:tc>
           <w:tcPr>
-            <w:tcW w:type="dxa" w:w="4320"/>
+            <w:tcW w:type="dxa" w:w="1872"/>
+            <w:shd w:fill="F8FAFC"/>
           </w:tcPr>
           <w:p>
             <w:r>
-              <w:rPr>
-                <w:sz w:val="18"/>
-              </w:rPr>
-              <w:t>Objetivo del proceso</w:t>
+              <w:t>**Víctor Raúl Cárdenas**</w:t>
             </w:r>
           </w:p>
         </w:tc>
         <w:tc>
           <w:tcPr>
-            <w:tcW w:type="dxa" w:w="4320"/>
+            <w:tcW w:type="dxa" w:w="1872"/>
+            <w:shd w:fill="F8FAFC"/>
           </w:tcPr>
           <w:p>
             <w:r>
-              <w:rPr>
-                <w:sz w:val="18"/>
-              </w:rPr>
-              <w:t>Gestionar y despachar los pedidos de los clientes de manera ágil, confiable y organizada.</w:t>
+              <w:t>Administrador / Dueño</w:t>
+            </w:r>
+          </w:p>
+        </w:tc>
+        <w:tc>
+          <w:tcPr>
+            <w:tcW w:type="dxa" w:w="1872"/>
+            <w:shd w:fill="F8FAFC"/>
+          </w:tcPr>
+          <w:p>
+            <w:r>
+              <w:t>Centralizar pedidos, controlar stock en tiempo real y actualizar estados de entrega con un clic.</w:t>
+            </w:r>
+          </w:p>
+        </w:tc>
+        <w:tc>
+          <w:tcPr>
+            <w:tcW w:type="dxa" w:w="1872"/>
+            <w:shd w:fill="F8FAFC"/>
+          </w:tcPr>
+          <w:p>
+            <w:r>
+              <w:t>Sobrecarga de trabajo operativo, errores de registro manuscrito y falta de trazabilidad.</w:t>
+            </w:r>
+          </w:p>
+        </w:tc>
+        <w:tc>
+          <w:tcPr>
+            <w:tcW w:type="dxa" w:w="1872"/>
+            <w:shd w:fill="F8FAFC"/>
+          </w:tcPr>
+          <w:p>
+            <w:r>
+              <w:t>Pruebas de usabilidad del panel administrativo y flujo de pedidos en vivo.</w:t>
             </w:r>
           </w:p>
         </w:tc>
@@ -697,27 +697,51 @@
       <w:tr>
         <w:tc>
           <w:tcPr>
-            <w:tcW w:type="dxa" w:w="4320"/>
+            <w:tcW w:type="dxa" w:w="1872"/>
           </w:tcPr>
           <w:p>
             <w:r>
-              <w:rPr>
-                <w:sz w:val="18"/>
-              </w:rPr>
-              <w:t>Actores principales</w:t>
+              <w:t>**Cliente Deportivo**</w:t>
             </w:r>
           </w:p>
         </w:tc>
         <w:tc>
           <w:tcPr>
-            <w:tcW w:type="dxa" w:w="4320"/>
+            <w:tcW w:type="dxa" w:w="1872"/>
           </w:tcPr>
           <w:p>
             <w:r>
-              <w:rPr>
-                <w:sz w:val="18"/>
-              </w:rPr>
-              <w:t>1. Víctor Raúl Cárdenas: Dueño/Administrador general.&lt;br&gt;2. Cliente: Comprador de ropa deportiva.&lt;br&gt;3. Servicio de Delivery: Tercerizado para entrega física.</w:t>
+              <w:t>Comprador final</w:t>
+            </w:r>
+          </w:p>
+        </w:tc>
+        <w:tc>
+          <w:tcPr>
+            <w:tcW w:type="dxa" w:w="1872"/>
+          </w:tcPr>
+          <w:p>
+            <w:r>
+              <w:t>Explorar prendas con tallas y precios actualizados, calcular totales y confirmar su orden en $&lt; 2$ minutos.</w:t>
+            </w:r>
+          </w:p>
+        </w:tc>
+        <w:tc>
+          <w:tcPr>
+            <w:tcW w:type="dxa" w:w="1872"/>
+          </w:tcPr>
+          <w:p>
+            <w:r>
+              <w:t>Respuestas demoradas por chat, falta de catálogo ordenado y desconocimiento del estado de entrega.</w:t>
+            </w:r>
+          </w:p>
+        </w:tc>
+        <w:tc>
+          <w:tcPr>
+            <w:tcW w:type="dxa" w:w="1872"/>
+          </w:tcPr>
+          <w:p>
+            <w:r>
+              <w:t>Tasa de conversión de pedidos y reducción del tiempo de espera.</w:t>
             </w:r>
           </w:p>
         </w:tc>
@@ -725,83 +749,56 @@
       <w:tr>
         <w:tc>
           <w:tcPr>
-            <w:tcW w:type="dxa" w:w="4320"/>
+            <w:tcW w:type="dxa" w:w="1872"/>
+            <w:shd w:fill="F8FAFC"/>
           </w:tcPr>
           <w:p>
             <w:r>
-              <w:rPr>
-                <w:sz w:val="18"/>
-              </w:rPr>
-              <w:t>Entradas</w:t>
+              <w:t>**Equipo de Proyecto**</w:t>
             </w:r>
           </w:p>
         </w:tc>
         <w:tc>
           <w:tcPr>
-            <w:tcW w:type="dxa" w:w="4320"/>
+            <w:tcW w:type="dxa" w:w="1872"/>
+            <w:shd w:fill="F8FAFC"/>
           </w:tcPr>
           <w:p>
             <w:r>
-              <w:rPr>
-                <w:sz w:val="18"/>
-              </w:rPr>
-              <w:t>Mensajes de WhatsApp, llamadas telefónicas, consultas de Facebook con solicitudes de tallas, colores y precios.</w:t>
-            </w:r>
-          </w:p>
-        </w:tc>
-      </w:tr>
-      <w:tr>
-        <w:tc>
-          <w:tcPr>
-            <w:tcW w:type="dxa" w:w="4320"/>
-          </w:tcPr>
-          <w:p>
-            <w:r>
-              <w:rPr>
-                <w:sz w:val="18"/>
-              </w:rPr>
-              <w:t>Salidas</w:t>
+              <w:t>Desarrolladores UTP</w:t>
             </w:r>
           </w:p>
         </w:tc>
         <w:tc>
           <w:tcPr>
-            <w:tcW w:type="dxa" w:w="4320"/>
+            <w:tcW w:type="dxa" w:w="1872"/>
+            <w:shd w:fill="F8FAFC"/>
           </w:tcPr>
           <w:p>
             <w:r>
-              <w:rPr>
-                <w:sz w:val="18"/>
-              </w:rPr>
-              <w:t>Pedido confirmado, registrado (en cuaderno), producto empaquetado y entregado al cliente con comprobante.</w:t>
-            </w:r>
-          </w:p>
-        </w:tc>
-      </w:tr>
-      <w:tr>
-        <w:tc>
-          <w:tcPr>
-            <w:tcW w:type="dxa" w:w="4320"/>
-          </w:tcPr>
-          <w:p>
-            <w:r>
-              <w:rPr>
-                <w:sz w:val="18"/>
-              </w:rPr>
-              <w:t>Herramientas actuales</w:t>
+              <w:t>Requerimientos técnicos claros, acceso a datos sintéticos y retroalimentación iterativa.</w:t>
             </w:r>
           </w:p>
         </w:tc>
         <w:tc>
           <w:tcPr>
-            <w:tcW w:type="dxa" w:w="4320"/>
+            <w:tcW w:type="dxa" w:w="1872"/>
+            <w:shd w:fill="F8FAFC"/>
           </w:tcPr>
           <w:p>
             <w:r>
-              <w:rPr>
-                <w:sz w:val="18"/>
-              </w:rPr>
-              <w:t>WhatsApp personal, teléfono, Facebook Marketplace, libreta de notas físicas.</w:t>
+              <w:t>Tiempo limitado del stakeholder por su dedicación a la operación diaria.</w:t>
+            </w:r>
+          </w:p>
+        </w:tc>
+        <w:tc>
+          <w:tcPr>
+            <w:tcW w:type="dxa" w:w="1872"/>
+            <w:shd w:fill="F8FAFC"/>
+          </w:tcPr>
+          <w:p>
+            <w:r>
+              <w:t>Sesiones semanales de Sprint Review estructuradas de 30 minutos.</w:t>
             </w:r>
           </w:p>
         </w:tc>
@@ -810,11 +807,16 @@
     <w:p/>
     <w:p>
       <w:pPr>
-        <w:pStyle w:val="Heading3"/>
-        <w:spacing w:before="160" w:after="60"/>
+        <w:spacing w:before="160" w:after="40"/>
       </w:pPr>
       <w:r>
-        <w:t>5. PROCESO ACTUAL (AS-IS)</w:t>
+        <w:rPr>
+          <w:rFonts w:ascii="Calibri" w:hAnsi="Calibri"/>
+          <w:b/>
+          <w:color w:val="1E293B"/>
+          <w:sz w:val="24"/>
+        </w:rPr>
+        <w:t>6. HIPÓTESIS DE SOLUCIÓN Y ALCANCE DEL MVP</w:t>
       </w:r>
     </w:p>
     <w:p>
@@ -823,7 +825,7 @@
         <w:spacing w:after="40"/>
       </w:pPr>
       <w:r>
-        <w:t>Nombre del proceso: Recepción y gestión manual de pedidos por canales no especializados.</w:t>
+        <w:t>Tipo de Solución: Sistema Web Progresivo (PWA) responsivo, accesible desde navegadores móviles y de escritorio sin requerir descargas pesadas desde tiendas de aplicaciones.</w:t>
       </w:r>
     </w:p>
     <w:p>
@@ -832,25 +834,7 @@
         <w:spacing w:after="40"/>
       </w:pPr>
       <w:r>
-        <w:t>Disparador (Trigger): Llegada de un mensaje o llamada de un cliente interesado.</w:t>
-      </w:r>
-    </w:p>
-    <w:p>
-      <w:pPr>
-        <w:pStyle w:val="ListBullet"/>
-        <w:spacing w:after="40"/>
-      </w:pPr>
-      <w:r>
-        <w:t>Responsable: Víctor Raúl Cárdenas Ramírez.</w:t>
-      </w:r>
-    </w:p>
-    <w:p>
-      <w:pPr>
-        <w:pStyle w:val="ListBullet"/>
-        <w:spacing w:after="40"/>
-      </w:pPr>
-      <w:r>
-        <w:t>Fin del proceso: Pedido entregado al cliente, rechazo por falta de stock o desistimiento del comprador.</w:t>
+        <w:t>Cinco Funcionalidades Principales del MVP:</w:t>
       </w:r>
     </w:p>
     <w:p>
@@ -858,7 +842,7 @@
         <w:spacing w:after="80"/>
       </w:pPr>
       <w:r>
-        <w:t>#### Secuencia de Pasos Actual:</w:t>
+        <w:t>1. Catálogo Interactivo: Visualización reactiva con filtros dinámicos por categoría, talla, color y precio.</w:t>
       </w:r>
     </w:p>
     <w:p>
@@ -866,7 +850,7 @@
         <w:spacing w:after="80"/>
       </w:pPr>
       <w:r>
-        <w:t>1. Atención inicial: Recibir la llamada o leer el mensaje en WhatsApp.</w:t>
+        <w:t>2. Carrito de Compras y Control de Stock: Cálculo automático de importes y bloqueo de pedidos que excedan existencias reales.</w:t>
       </w:r>
     </w:p>
     <w:p>
@@ -874,7 +858,7 @@
         <w:spacing w:after="80"/>
       </w:pPr>
       <w:r>
-        <w:t>2. Recepción del pedido: Leer la solicitud (tipo de prenda, talla, color, cantidad).</w:t>
+        <w:t>3. Toma y Registro Formal de Pedidos: Formulario validado con generación automática de código identificador único de orden.</w:t>
       </w:r>
     </w:p>
     <w:p>
@@ -882,7 +866,7 @@
         <w:spacing w:after="80"/>
       </w:pPr>
       <w:r>
-        <w:t>3. Verificación de disponibilidad: Revisar físicamente o de memoria el inventario de stock.</w:t>
+        <w:t>4. Módulo de Trazabilidad de Estados: Cambio de estados operativo (`Recibido`, `En Preparación`, `En Camino`, `Entregado`, `Cancelado`).</w:t>
       </w:r>
     </w:p>
     <w:p>
@@ -890,83 +874,21 @@
         <w:spacing w:after="80"/>
       </w:pPr>
       <w:r>
-        <w:t>4. Cotización y condiciones: Informar precio, costo de envío y tiempos estimados de entrega.</w:t>
+        <w:t>5. Dashboard Administrativo: Indicadores cuantitativos en tiempo real de ventas de la jornada, pedidos pendientes y alertas de stock bajo.</w:t>
       </w:r>
     </w:p>
     <w:p>
       <w:pPr>
-        <w:spacing w:after="80"/>
+        <w:spacing w:before="160" w:after="40"/>
       </w:pPr>
       <w:r>
-        <w:t>5. Confirmación del cliente: Esperar respuesta y confirmación de compra por parte del cliente.</w:t>
-      </w:r>
-    </w:p>
-    <w:p>
-      <w:pPr>
-        <w:spacing w:after="80"/>
-      </w:pPr>
-      <w:r>
-        <w:t>6. Registro manual: Anotar los datos del cliente (nombre, teléfono, dirección, productos) en libreta/cuaderno o notas de celular.</w:t>
-      </w:r>
-    </w:p>
-    <w:p>
-      <w:pPr>
-        <w:spacing w:after="80"/>
-      </w:pPr>
-      <w:r>
-        <w:t>7. Envío de confirmación: Notificar manualmente al cliente la aceptación de su pedido.</w:t>
-      </w:r>
-    </w:p>
-    <w:p>
-      <w:pPr>
-        <w:spacing w:after="80"/>
-      </w:pPr>
-      <w:r>
-        <w:t>8. Preparación del paquete: Seleccionar las prendas del almacén físico y empaquetarlas.</w:t>
-      </w:r>
-    </w:p>
-    <w:p>
-      <w:pPr>
-        <w:spacing w:after="80"/>
-      </w:pPr>
-      <w:r>
-        <w:t>9. Coordinación de despacho: Contactar al servicio de delivery motorizado y despachar el producto.</w:t>
-      </w:r>
-    </w:p>
-    <w:p>
-      <w:pPr>
-        <w:pStyle w:val="Heading3"/>
-        <w:spacing w:before="160" w:after="60"/>
-      </w:pPr>
-      <w:r>
-        <w:t>6. PROBLEMA U OPORTUNIDAD DE INNOVACIÓN</w:t>
-      </w:r>
-    </w:p>
-    <w:p>
-      <w:pPr>
-        <w:spacing w:after="80"/>
-        <w:ind w:left="576"/>
-      </w:pPr>
-      <w:r>
-        <w:t>"Definición del Problema:"</w:t>
-      </w:r>
-    </w:p>
-    <w:p>
-      <w:pPr>
-        <w:spacing w:after="80"/>
-        <w:ind w:left="576"/>
-      </w:pPr>
-      <w:r>
-        <w:t>"*"La gestión manual y descentralizada de pedidos a través de canales de mensajería (WhatsApp y llamadas) para la venta de ropa deportiva en 'Leofit' provoca ineficiencias operativas, pérdida de tiempo, errores en los registros de inventario y datos de envío, generando una menor tasa de conversión de ventas y una deficiente experiencia para el cliente."*"</w:t>
-      </w:r>
-    </w:p>
-    <w:p>
-      <w:pPr>
-        <w:pStyle w:val="Heading3"/>
-        <w:spacing w:before="160" w:after="60"/>
-      </w:pPr>
-      <w:r>
-        <w:t>7. ACTORES Y NECESIDADES</w:t>
+        <w:rPr>
+          <w:rFonts w:ascii="Calibri" w:hAnsi="Calibri"/>
+          <w:b/>
+          <w:color w:val="1E293B"/>
+          <w:sz w:val="24"/>
+        </w:rPr>
+        <w:t>7. FACTIBILIDAD Y EVALUACIÓN DE VIABILIDAD</w:t>
       </w:r>
     </w:p>
     <w:tbl>
@@ -976,65 +898,53 @@
         <w:tblLook w:firstColumn="1" w:firstRow="1" w:lastColumn="0" w:lastRow="0" w:noHBand="0" w:noVBand="1" w:val="04A0"/>
       </w:tblPr>
       <w:tblGrid>
-        <w:gridCol w:w="2160"/>
-        <w:gridCol w:w="2160"/>
-        <w:gridCol w:w="2160"/>
-        <w:gridCol w:w="2160"/>
+        <w:gridCol w:w="3120"/>
+        <w:gridCol w:w="3120"/>
+        <w:gridCol w:w="3120"/>
       </w:tblGrid>
       <w:tr>
         <w:tc>
           <w:tcPr>
-            <w:tcW w:type="dxa" w:w="2160"/>
+            <w:tcW w:type="dxa" w:w="3120"/>
+            <w:shd w:fill="0F172A"/>
           </w:tcPr>
           <w:p>
             <w:r>
               <w:rPr>
                 <w:b/>
-                <w:sz w:val="18"/>
+                <w:color w:val="FFFFFF"/>
               </w:rPr>
-              <w:t>Actor / Usuario</w:t>
+              <w:t>Criterio de Viabilidad</w:t>
             </w:r>
           </w:p>
         </w:tc>
         <w:tc>
           <w:tcPr>
-            <w:tcW w:type="dxa" w:w="2160"/>
+            <w:tcW w:type="dxa" w:w="3120"/>
+            <w:shd w:fill="0F172A"/>
           </w:tcPr>
           <w:p>
             <w:r>
               <w:rPr>
                 <w:b/>
-                <w:sz w:val="18"/>
+                <w:color w:val="FFFFFF"/>
               </w:rPr>
-              <w:t>¿Qué necesita?</w:t>
+              <w:t>Evaluación</w:t>
             </w:r>
           </w:p>
         </w:tc>
         <w:tc>
           <w:tcPr>
-            <w:tcW w:type="dxa" w:w="2160"/>
+            <w:tcW w:type="dxa" w:w="3120"/>
+            <w:shd w:fill="0F172A"/>
           </w:tcPr>
           <w:p>
             <w:r>
               <w:rPr>
                 <w:b/>
-                <w:sz w:val="18"/>
+                <w:color w:val="FFFFFF"/>
               </w:rPr>
-              <w:t>Dificultad actual</w:t>
-            </w:r>
-          </w:p>
-        </w:tc>
-        <w:tc>
-          <w:tcPr>
-            <w:tcW w:type="dxa" w:w="2160"/>
-          </w:tcPr>
-          <w:p>
-            <w:r>
-              <w:rPr>
-                <w:b/>
-                <w:sz w:val="18"/>
-              </w:rPr>
-              <w:t>Validación</w:t>
+              <w:t>Sustentación Técnica</w:t>
             </w:r>
           </w:p>
         </w:tc>
@@ -1042,53 +952,34 @@
       <w:tr>
         <w:tc>
           <w:tcPr>
-            <w:tcW w:type="dxa" w:w="2160"/>
+            <w:tcW w:type="dxa" w:w="3120"/>
+            <w:shd w:fill="F8FAFC"/>
           </w:tcPr>
           <w:p>
             <w:r>
-              <w:rPr>
-                <w:sz w:val="18"/>
-              </w:rPr>
-              <w:t>Dueño / Administrador (Víctor)</w:t>
+              <w:t>**Acceso a Experto del Proceso**</w:t>
             </w:r>
           </w:p>
         </w:tc>
         <w:tc>
           <w:tcPr>
-            <w:tcW w:type="dxa" w:w="2160"/>
+            <w:tcW w:type="dxa" w:w="3120"/>
+            <w:shd w:fill="F8FAFC"/>
           </w:tcPr>
           <w:p>
             <w:r>
-              <w:rPr>
-                <w:sz w:val="18"/>
-              </w:rPr>
-              <w:t>Centralizar pedidos, controlar stock en tiempo real y actualizar estados de pedidos con un clic.</w:t>
+              <w:t>Sí</w:t>
             </w:r>
           </w:p>
         </w:tc>
         <w:tc>
           <w:tcPr>
-            <w:tcW w:type="dxa" w:w="2160"/>
+            <w:tcW w:type="dxa" w:w="3120"/>
+            <w:shd w:fill="F8FAFC"/>
           </w:tcPr>
           <w:p>
             <w:r>
-              <w:rPr>
-                <w:sz w:val="18"/>
-              </w:rPr>
-              <w:t>Sobrecarga de trabajo, errores de anotación y falta de control de inventario.</w:t>
-            </w:r>
-          </w:p>
-        </w:tc>
-        <w:tc>
-          <w:tcPr>
-            <w:tcW w:type="dxa" w:w="2160"/>
-          </w:tcPr>
-          <w:p>
-            <w:r>
-              <w:rPr>
-                <w:sz w:val="18"/>
-              </w:rPr>
-              <w:t>Pruebas de usabilidad con el prototipo y flujo real de pedidos.</w:t>
+              <w:t>Contacto directo y comprometido con el dueño del negocio.</w:t>
             </w:r>
           </w:p>
         </w:tc>
@@ -1096,53 +987,31 @@
       <w:tr>
         <w:tc>
           <w:tcPr>
-            <w:tcW w:type="dxa" w:w="2160"/>
+            <w:tcW w:type="dxa" w:w="3120"/>
           </w:tcPr>
           <w:p>
             <w:r>
-              <w:rPr>
-                <w:sz w:val="18"/>
-              </w:rPr>
-              <w:t>Clientes</w:t>
+              <w:t>**Evidencia Comprobable**</w:t>
             </w:r>
           </w:p>
         </w:tc>
         <w:tc>
           <w:tcPr>
-            <w:tcW w:type="dxa" w:w="2160"/>
+            <w:tcW w:type="dxa" w:w="3120"/>
           </w:tcPr>
           <w:p>
             <w:r>
-              <w:rPr>
-                <w:sz w:val="18"/>
-              </w:rPr>
-              <w:t>Información clara de productos, confirmación rápida de su compra y seguimiento de entrega.</w:t>
+              <w:t>Sí</w:t>
             </w:r>
           </w:p>
         </w:tc>
         <w:tc>
           <w:tcPr>
-            <w:tcW w:type="dxa" w:w="2160"/>
+            <w:tcW w:type="dxa" w:w="3120"/>
           </w:tcPr>
           <w:p>
             <w:r>
-              <w:rPr>
-                <w:sz w:val="18"/>
-              </w:rPr>
-              <w:t>Demoras en respuesta, falta de confianza y desinformación del estado de su entrega.</w:t>
-            </w:r>
-          </w:p>
-        </w:tc>
-        <w:tc>
-          <w:tcPr>
-            <w:tcW w:type="dxa" w:w="2160"/>
-          </w:tcPr>
-          <w:p>
-            <w:r>
-              <w:rPr>
-                <w:sz w:val="18"/>
-              </w:rPr>
-              <w:t>Tasa de satisfacción y reducción del tiempo de espera.</w:t>
+              <w:t>Registros físicos, capturas de chat y validación presencial.</w:t>
             </w:r>
           </w:p>
         </w:tc>
@@ -1150,53 +1019,133 @@
       <w:tr>
         <w:tc>
           <w:tcPr>
-            <w:tcW w:type="dxa" w:w="2160"/>
+            <w:tcW w:type="dxa" w:w="3120"/>
+            <w:shd w:fill="F8FAFC"/>
           </w:tcPr>
           <w:p>
             <w:r>
-              <w:rPr>
-                <w:sz w:val="18"/>
-              </w:rPr>
-              <w:t>Equipo de Proyecto (OTI)</w:t>
+              <w:t>**Alcance Acotado**</w:t>
             </w:r>
           </w:p>
         </w:tc>
         <w:tc>
           <w:tcPr>
-            <w:tcW w:type="dxa" w:w="2160"/>
+            <w:tcW w:type="dxa" w:w="3120"/>
+            <w:shd w:fill="F8FAFC"/>
           </w:tcPr>
           <w:p>
             <w:r>
-              <w:rPr>
-                <w:sz w:val="18"/>
-              </w:rPr>
-              <w:t>Requerimientos claros y acceso oportuno al stakeholder para iteraciones.</w:t>
+              <w:t>Sí</w:t>
             </w:r>
           </w:p>
         </w:tc>
         <w:tc>
           <w:tcPr>
-            <w:tcW w:type="dxa" w:w="2160"/>
+            <w:tcW w:type="dxa" w:w="3120"/>
+            <w:shd w:fill="F8FAFC"/>
           </w:tcPr>
           <w:p>
             <w:r>
-              <w:rPr>
-                <w:sz w:val="18"/>
-              </w:rPr>
-              <w:t>Tiempo limitado del dueño por sus múltiples tareas operativas.</w:t>
+              <w:t>Enfocado estrictamente en la gestión de pedidos e inventario.</w:t>
+            </w:r>
+          </w:p>
+        </w:tc>
+      </w:tr>
+      <w:tr>
+        <w:tc>
+          <w:tcPr>
+            <w:tcW w:type="dxa" w:w="3120"/>
+          </w:tcPr>
+          <w:p>
+            <w:r>
+              <w:t>**Factibilidad Técnica**</w:t>
             </w:r>
           </w:p>
         </w:tc>
         <w:tc>
           <w:tcPr>
-            <w:tcW w:type="dxa" w:w="2160"/>
+            <w:tcW w:type="dxa" w:w="3120"/>
           </w:tcPr>
           <w:p>
             <w:r>
-              <w:rPr>
-                <w:sz w:val="18"/>
-              </w:rPr>
-              <w:t>Validación semanal de avances y actas de conformidad.</w:t>
+              <w:t>Sí</w:t>
+            </w:r>
+          </w:p>
+        </w:tc>
+        <w:tc>
+          <w:tcPr>
+            <w:tcW w:type="dxa" w:w="3120"/>
+          </w:tcPr>
+          <w:p>
+            <w:r>
+              <w:t>Pila tecnológica madura y probada (React 18, TypeScript, Vite, Tailwind CSS y Node.js).</w:t>
+            </w:r>
+          </w:p>
+        </w:tc>
+      </w:tr>
+      <w:tr>
+        <w:tc>
+          <w:tcPr>
+            <w:tcW w:type="dxa" w:w="3120"/>
+            <w:shd w:fill="F8FAFC"/>
+          </w:tcPr>
+          <w:p>
+            <w:r>
+              <w:t>**Protección de Datos**</w:t>
+            </w:r>
+          </w:p>
+        </w:tc>
+        <w:tc>
+          <w:tcPr>
+            <w:tcW w:type="dxa" w:w="3120"/>
+            <w:shd w:fill="F8FAFC"/>
+          </w:tcPr>
+          <w:p>
+            <w:r>
+              <w:t>Sí</w:t>
+            </w:r>
+          </w:p>
+        </w:tc>
+        <w:tc>
+          <w:tcPr>
+            <w:tcW w:type="dxa" w:w="3120"/>
+            <w:shd w:fill="F8FAFC"/>
+          </w:tcPr>
+          <w:p>
+            <w:r>
+              <w:t>Uso de datos sintéticos y homologación conforme a la Ley de Protección de Datos Personales.</w:t>
+            </w:r>
+          </w:p>
+        </w:tc>
+      </w:tr>
+      <w:tr>
+        <w:tc>
+          <w:tcPr>
+            <w:tcW w:type="dxa" w:w="3120"/>
+          </w:tcPr>
+          <w:p>
+            <w:r>
+              <w:t>**Despliegue Operativo**</w:t>
+            </w:r>
+          </w:p>
+        </w:tc>
+        <w:tc>
+          <w:tcPr>
+            <w:tcW w:type="dxa" w:w="3120"/>
+          </w:tcPr>
+          <w:p>
+            <w:r>
+              <w:t>Sí</w:t>
+            </w:r>
+          </w:p>
+        </w:tc>
+        <w:tc>
+          <w:tcPr>
+            <w:tcW w:type="dxa" w:w="3120"/>
+          </w:tcPr>
+          <w:p>
+            <w:r>
+              <w:t>Despliegue automatizado en CDN Serverless (GitHub Pages / Vercel) con alta disponibilidad.</w:t>
             </w:r>
           </w:p>
         </w:tc>
@@ -1205,38 +1154,16 @@
     <w:p/>
     <w:p>
       <w:pPr>
-        <w:pStyle w:val="Heading3"/>
-        <w:spacing w:before="160" w:after="60"/>
+        <w:spacing w:before="160" w:after="40"/>
       </w:pPr>
       <w:r>
-        <w:t>8. HIPÓTESIS DE SOLUCIÓN</w:t>
-      </w:r>
-    </w:p>
-    <w:p>
-      <w:pPr>
-        <w:pStyle w:val="ListBullet"/>
-        <w:spacing w:after="40"/>
-      </w:pPr>
-      <w:r>
-        <w:t>Tipo de Solución: Sistema Web de Gestión de Pedidos (*Progressive Web App - PWA*), responsivo para acceso móvil y de escritorio sin requerir instalación pesada.</w:t>
-      </w:r>
-    </w:p>
-    <w:p>
-      <w:pPr>
-        <w:pStyle w:val="ListBullet"/>
-        <w:spacing w:after="40"/>
-      </w:pPr>
-      <w:r>
-        <w:t>Usuarios principales: Administrador (Víctor Raúl Cárdenas).</w:t>
-      </w:r>
-    </w:p>
-    <w:p>
-      <w:pPr>
-        <w:pStyle w:val="ListBullet"/>
-        <w:spacing w:after="40"/>
-      </w:pPr>
-      <w:r>
-        <w:t>Valor agregado: Centralización de inventario y pedidos, reducción de tiempos operativos, trazabilidad de pedidos por estados y notificaciones claras.</w:t>
+        <w:rPr>
+          <w:rFonts w:ascii="Calibri" w:hAnsi="Calibri"/>
+          <w:b/>
+          <w:color w:val="1E293B"/>
+          <w:sz w:val="24"/>
+        </w:rPr>
+        <w:t>8. PITCH TÉCNICO DEL PROYECTO</w:t>
       </w:r>
     </w:p>
     <w:p>
@@ -1244,457 +1171,12 @@
         <w:spacing w:after="80"/>
       </w:pPr>
       <w:r>
-        <w:t>#### 5 Funcionalidades Principales (MVP):</w:t>
-      </w:r>
-    </w:p>
-    <w:p>
-      <w:pPr>
-        <w:spacing w:after="80"/>
-      </w:pPr>
-      <w:r>
-        <w:t>1. Panel de Gestión de Productos e Inventario: Altas, bajas, modificaciones de prendas deportivas con tallas, colores, precios y control de stock.</w:t>
-      </w:r>
-    </w:p>
-    <w:p>
-      <w:pPr>
-        <w:spacing w:after="80"/>
-      </w:pPr>
-      <w:r>
-        <w:t>2. Registro Centralizado de Pedidos: Formulario ágil para registrar pedidos con asignación automática de ID único, datos de cliente y detalle de productos.</w:t>
-      </w:r>
-    </w:p>
-    <w:p>
-      <w:pPr>
-        <w:spacing w:after="80"/>
-      </w:pPr>
-      <w:r>
-        <w:t>3. Módulo de Estados y Trazabilidad: Cambio de estado con un clic (Recibido, En Preparación, En Camino, Entregado, Cancelado).</w:t>
-      </w:r>
-    </w:p>
-    <w:p>
-      <w:pPr>
-        <w:spacing w:after="80"/>
-      </w:pPr>
-      <w:r>
-        <w:t>4. Historial y Búsqueda de Pedidos/Clientes: Filtros por fecha, cliente, producto y estado para consulta rápida.</w:t>
-      </w:r>
-    </w:p>
-    <w:p>
-      <w:pPr>
-        <w:spacing w:after="80"/>
-      </w:pPr>
-      <w:r>
-        <w:t>5. Generación de Resúmenes y Notificaciones: Creación automática del resumen de compra listo para compartir con el cliente.</w:t>
-      </w:r>
-    </w:p>
-    <w:p>
-      <w:pPr>
-        <w:pStyle w:val="Heading3"/>
-        <w:spacing w:before="160" w:after="60"/>
-      </w:pPr>
-      <w:r>
-        <w:t>9. ALCANCE Y VIABILIDAD INICIAL</w:t>
-      </w:r>
-    </w:p>
-    <w:tbl>
-      <w:tblPr>
-        <w:tblW w:type="auto" w:w="0"/>
-        <w:jc w:val="center"/>
-        <w:tblLook w:firstColumn="1" w:firstRow="1" w:lastColumn="0" w:lastRow="0" w:noHBand="0" w:noVBand="1" w:val="04A0"/>
-      </w:tblPr>
-      <w:tblGrid>
-        <w:gridCol w:w="2880"/>
-        <w:gridCol w:w="2880"/>
-        <w:gridCol w:w="2880"/>
-      </w:tblGrid>
-      <w:tr>
-        <w:tc>
-          <w:tcPr>
-            <w:tcW w:type="dxa" w:w="2880"/>
-          </w:tcPr>
-          <w:p>
-            <w:r>
-              <w:rPr>
-                <w:b/>
-                <w:sz w:val="18"/>
-              </w:rPr>
-              <w:t>Criterio</w:t>
-            </w:r>
-          </w:p>
-        </w:tc>
-        <w:tc>
-          <w:tcPr>
-            <w:tcW w:type="dxa" w:w="2880"/>
-          </w:tcPr>
-          <w:p>
-            <w:r>
-              <w:rPr>
-                <w:b/>
-                <w:sz w:val="18"/>
-              </w:rPr>
-              <w:t>Evaluación</w:t>
-            </w:r>
-          </w:p>
-        </w:tc>
-        <w:tc>
-          <w:tcPr>
-            <w:tcW w:type="dxa" w:w="2880"/>
-          </w:tcPr>
-          <w:p>
-            <w:r>
-              <w:rPr>
-                <w:b/>
-                <w:sz w:val="18"/>
-              </w:rPr>
-              <w:t>Justificación</w:t>
-            </w:r>
-          </w:p>
-        </w:tc>
-      </w:tr>
-      <w:tr>
-        <w:tc>
-          <w:tcPr>
-            <w:tcW w:type="dxa" w:w="2880"/>
-          </w:tcPr>
-          <w:p>
-            <w:r>
-              <w:rPr>
-                <w:sz w:val="18"/>
-              </w:rPr>
-              <w:t>Acceso a experto del proceso</w:t>
-            </w:r>
-          </w:p>
-        </w:tc>
-        <w:tc>
-          <w:tcPr>
-            <w:tcW w:type="dxa" w:w="2880"/>
-          </w:tcPr>
-          <w:p>
-            <w:r>
-              <w:rPr>
-                <w:sz w:val="18"/>
-              </w:rPr>
-              <w:t>Sí</w:t>
-            </w:r>
-          </w:p>
-        </w:tc>
-        <w:tc>
-          <w:tcPr>
-            <w:tcW w:type="dxa" w:w="2880"/>
-          </w:tcPr>
-          <w:p>
-            <w:r>
-              <w:rPr>
-                <w:sz w:val="18"/>
-              </w:rPr>
-              <w:t>Contacto directo y comprometido con el dueño.</w:t>
-            </w:r>
-          </w:p>
-        </w:tc>
-      </w:tr>
-      <w:tr>
-        <w:tc>
-          <w:tcPr>
-            <w:tcW w:type="dxa" w:w="2880"/>
-          </w:tcPr>
-          <w:p>
-            <w:r>
-              <w:rPr>
-                <w:sz w:val="18"/>
-              </w:rPr>
-              <w:t>Evidencia comprobable</w:t>
-            </w:r>
-          </w:p>
-        </w:tc>
-        <w:tc>
-          <w:tcPr>
-            <w:tcW w:type="dxa" w:w="2880"/>
-          </w:tcPr>
-          <w:p>
-            <w:r>
-              <w:rPr>
-                <w:sz w:val="18"/>
-              </w:rPr>
-              <w:t>Sí</w:t>
-            </w:r>
-          </w:p>
-        </w:tc>
-        <w:tc>
-          <w:tcPr>
-            <w:tcW w:type="dxa" w:w="2880"/>
-          </w:tcPr>
-          <w:p>
-            <w:r>
-              <w:rPr>
-                <w:sz w:val="18"/>
-              </w:rPr>
-              <w:t>Cuaderno de pedidos, chats y validación directa.</w:t>
-            </w:r>
-          </w:p>
-        </w:tc>
-      </w:tr>
-      <w:tr>
-        <w:tc>
-          <w:tcPr>
-            <w:tcW w:type="dxa" w:w="2880"/>
-          </w:tcPr>
-          <w:p>
-            <w:r>
-              <w:rPr>
-                <w:sz w:val="18"/>
-              </w:rPr>
-              <w:t>Alcance acotado a un proceso</w:t>
-            </w:r>
-          </w:p>
-        </w:tc>
-        <w:tc>
-          <w:tcPr>
-            <w:tcW w:type="dxa" w:w="2880"/>
-          </w:tcPr>
-          <w:p>
-            <w:r>
-              <w:rPr>
-                <w:sz w:val="18"/>
-              </w:rPr>
-              <w:t>Sí</w:t>
-            </w:r>
-          </w:p>
-        </w:tc>
-        <w:tc>
-          <w:tcPr>
-            <w:tcW w:type="dxa" w:w="2880"/>
-          </w:tcPr>
-          <w:p>
-            <w:r>
-              <w:rPr>
-                <w:sz w:val="18"/>
-              </w:rPr>
-              <w:t>Enfocado estrictamente en "Gestión de Pedidos e Inventario".</w:t>
-            </w:r>
-          </w:p>
-        </w:tc>
-      </w:tr>
-      <w:tr>
-        <w:tc>
-          <w:tcPr>
-            <w:tcW w:type="dxa" w:w="2880"/>
-          </w:tcPr>
-          <w:p>
-            <w:r>
-              <w:rPr>
-                <w:sz w:val="18"/>
-              </w:rPr>
-              <w:t>Factibilidad técnica en el curso</w:t>
-            </w:r>
-          </w:p>
-        </w:tc>
-        <w:tc>
-          <w:tcPr>
-            <w:tcW w:type="dxa" w:w="2880"/>
-          </w:tcPr>
-          <w:p>
-            <w:r>
-              <w:rPr>
-                <w:sz w:val="18"/>
-              </w:rPr>
-              <w:t>Sí</w:t>
-            </w:r>
-          </w:p>
-        </w:tc>
-        <w:tc>
-          <w:tcPr>
-            <w:tcW w:type="dxa" w:w="2880"/>
-          </w:tcPr>
-          <w:p>
-            <w:r>
-              <w:rPr>
-                <w:sz w:val="18"/>
-              </w:rPr>
-              <w:t>Stack moderno y probado (React/Node.js/Base de Datos Relacional).</w:t>
-            </w:r>
-          </w:p>
-        </w:tc>
-      </w:tr>
-      <w:tr>
-        <w:tc>
-          <w:tcPr>
-            <w:tcW w:type="dxa" w:w="2880"/>
-          </w:tcPr>
-          <w:p>
-            <w:r>
-              <w:rPr>
-                <w:sz w:val="18"/>
-              </w:rPr>
-              <w:t>Uso de datos sin confidencialidad</w:t>
-            </w:r>
-          </w:p>
-        </w:tc>
-        <w:tc>
-          <w:tcPr>
-            <w:tcW w:type="dxa" w:w="2880"/>
-          </w:tcPr>
-          <w:p>
-            <w:r>
-              <w:rPr>
-                <w:sz w:val="18"/>
-              </w:rPr>
-              <w:t>Sí</w:t>
-            </w:r>
-          </w:p>
-        </w:tc>
-        <w:tc>
-          <w:tcPr>
-            <w:tcW w:type="dxa" w:w="2880"/>
-          </w:tcPr>
-          <w:p>
-            <w:r>
-              <w:rPr>
-                <w:sz w:val="18"/>
-              </w:rPr>
-              <w:t>Pruebas con datos sintéticos y posterior homologación.</w:t>
-            </w:r>
-          </w:p>
-        </w:tc>
-      </w:tr>
-      <w:tr>
-        <w:tc>
-          <w:tcPr>
-            <w:tcW w:type="dxa" w:w="2880"/>
-          </w:tcPr>
-          <w:p>
-            <w:r>
-              <w:rPr>
-                <w:sz w:val="18"/>
-              </w:rPr>
-              <w:t>Despliegue viable</w:t>
-            </w:r>
-          </w:p>
-        </w:tc>
-        <w:tc>
-          <w:tcPr>
-            <w:tcW w:type="dxa" w:w="2880"/>
-          </w:tcPr>
-          <w:p>
-            <w:r>
-              <w:rPr>
-                <w:sz w:val="18"/>
-              </w:rPr>
-              <w:t>Sí</w:t>
-            </w:r>
-          </w:p>
-        </w:tc>
-        <w:tc>
-          <w:tcPr>
-            <w:tcW w:type="dxa" w:w="2880"/>
-          </w:tcPr>
-          <w:p>
-            <w:r>
-              <w:rPr>
-                <w:sz w:val="18"/>
-              </w:rPr>
-              <w:t>Plataformas Cloud gratuitas / PaaS (Vercel, Render, Railway).</w:t>
-            </w:r>
-          </w:p>
-        </w:tc>
-      </w:tr>
-    </w:tbl>
-    <w:p/>
-    <w:p>
-      <w:pPr>
-        <w:spacing w:after="80"/>
-      </w:pPr>
-      <w:r>
-        <w:t>#### Matriz de Alcance:</w:t>
-      </w:r>
-    </w:p>
-    <w:p>
-      <w:pPr>
-        <w:pStyle w:val="ListBullet"/>
-        <w:spacing w:after="40"/>
-      </w:pPr>
-      <w:r>
-        <w:t>INCLUYE: Panel de administración, catálogo interno de productos, registro ágil de pedidos, control de estados, historial y reportes básicos.</w:t>
-      </w:r>
-    </w:p>
-    <w:p>
-      <w:pPr>
-        <w:pStyle w:val="ListBullet"/>
-        <w:spacing w:after="40"/>
-      </w:pPr>
-      <w:r>
-        <w:t>NO INCLUYE: E-commerce público con pasarela bancaria compleja (Fase posterior), app nativa en Play Store/App Store, automatización de marketing en redes sociales.</w:t>
-      </w:r>
-    </w:p>
-    <w:p>
-      <w:pPr>
-        <w:pStyle w:val="Heading3"/>
-        <w:spacing w:before="160" w:after="60"/>
-      </w:pPr>
-      <w:r>
-        <w:t>10. RIESGOS INICIALES Y PLAN DE ACCIÓN</w:t>
-      </w:r>
-    </w:p>
-    <w:p>
-      <w:pPr>
-        <w:spacing w:after="80"/>
-      </w:pPr>
-      <w:r>
-        <w:t>1. Disponibilidad limitada del dueño: (Probabilidad: Alta | Impacto: Medio-Alto) -&gt; *Plan: Agendar reuniones breves, estructuradas y con horarios flexibles.*</w:t>
-      </w:r>
-    </w:p>
-    <w:p>
-      <w:pPr>
-        <w:spacing w:after="80"/>
-      </w:pPr>
-      <w:r>
-        <w:t>2. Ampliación descontrolada del alcance (Scope Creep): (Probabilidad: Media | Impacto: Alto) -&gt; *Plan: Priorización estricta bajo metodología MoSCoW para el MVP.*</w:t>
-      </w:r>
-    </w:p>
-    <w:p>
-      <w:pPr>
-        <w:spacing w:after="80"/>
-      </w:pPr>
-      <w:r>
-        <w:t>3. Fallas en servicios de terceros: (Probabilidad: Baja | Impacto: Medio) -&gt; *Plan: Arquitectura desacoplada y mecanismos de contingencia manual.*</w:t>
-      </w:r>
-    </w:p>
-    <w:p>
-      <w:pPr>
-        <w:spacing w:after="80"/>
-      </w:pPr>
-      <w:r>
-        <w:t>4. Resistencia al cambio tecnológico: (Probabilidad: Media | Impacto: Medio) -&gt; *Plan: Diseño UX intuitivo y sesiones guiadas de co-creación.*</w:t>
-      </w:r>
-    </w:p>
-    <w:p>
-      <w:pPr>
-        <w:spacing w:after="80"/>
-      </w:pPr>
-      <w:r>
-        <w:t>5. Tiempo insuficiente de desarrollo: (Probabilidad: Media | Impacto: Alto) -&gt; *Plan: Metodología ágil Scrum/Kanban, sprints semanales y arquitectura modular.*</w:t>
-      </w:r>
-    </w:p>
-    <w:p>
-      <w:pPr>
-        <w:pStyle w:val="Heading3"/>
-        <w:spacing w:before="160" w:after="60"/>
-      </w:pPr>
-      <w:r>
-        <w:t>11. PITCH DEL EQUIPO</w:t>
-      </w:r>
-    </w:p>
-    <w:p>
-      <w:pPr>
-        <w:spacing w:after="80"/>
-        <w:ind w:left="576"/>
-      </w:pPr>
-      <w:r>
-        <w:t>"*"Leofit es una empresa familiar peruana de venta de indumentaria deportiva. Actualmente, su dueño Víctor gestiona todas las ventas de forma manual a través de WhatsApp y notas en papel, lo que provoca demoras, pérdida de pedidos y sobrecarga operativa. Desarrollaremos un Sistema Web de Gestión de Pedidos que centralizará el inventario, agilizará el registro de compras y controlará los estados de despacho en tiempo real, garantizando una operación eficiente y escalable para el negocio."*"</w:t>
+        <w:t>"LeoFit es un negocio peruano de indumentaria deportiva que gestiona sus ventas manualmente por WhatsApp y notas en papel, generando demoras de 25 minutos por orden y riesgos de sobreventa. Desarrollamos una Progressive Web App (PWA) de ultra-bajo peso que permite a los clientes confirmar pedidos en 2 minutos con stock en tiempo real y brinda al administrador control integral del inventario y trazabilidad de despachos con un solo clic."</w:t>
       </w:r>
     </w:p>
     <w:sectPr>
       <w:pgSz w:w="12240" w:h="15840"/>
-      <w:pgMar w:top="1440" w:right="1800" w:bottom="1440" w:left="1800" w:header="720" w:footer="720" w:gutter="0"/>
+      <w:pgMar w:top="1440" w:right="1440" w:bottom="1440" w:left="1440" w:header="720" w:footer="720" w:gutter="0"/>
       <w:cols w:space="720"/>
       <w:docGrid w:linePitch="360"/>
     </w:sectPr>
@@ -2065,6 +1547,11 @@
     <w:name w:val="Normal"/>
     <w:qFormat/>
     <w:rsid w:val="00FC693F"/>
+    <w:rPr>
+      <w:rFonts w:ascii="Calibri" w:hAnsi="Calibri"/>
+      <w:color w:val="1E293B"/>
+      <w:sz w:val="22"/>
+    </w:rPr>
   </w:style>
   <w:style w:type="paragraph" w:styleId="Header">
     <w:name w:val="header"/>

</xml_diff>

<commit_message>
docs(pipeline): transformacion profesional por fases MD -> DOCX -> PDF con formato nativo de estilos y 0 asteriscos literales
</commit_message>
<xml_diff>
--- a/docs/01_Ficha_Identificacion.docx
+++ b/docs/01_Ficha_Identificacion.docx
@@ -4,6 +4,7 @@
   <w:body>
     <w:p>
       <w:pPr>
+        <w:keepNext/>
         <w:spacing w:before="320" w:after="120"/>
       </w:pPr>
       <w:r>
@@ -18,7 +19,8 @@
     </w:p>
     <w:p>
       <w:pPr>
-        <w:spacing w:before="240" w:after="80"/>
+        <w:keepNext/>
+        <w:spacing w:before="280" w:after="80"/>
       </w:pPr>
       <w:r>
         <w:rPr>
@@ -32,7 +34,8 @@
     </w:p>
     <w:p>
       <w:pPr>
-        <w:spacing w:before="160" w:after="40"/>
+        <w:keepNext/>
+        <w:spacing w:before="200" w:after="40"/>
       </w:pPr>
       <w:r>
         <w:rPr>
@@ -46,6 +49,7 @@
     </w:p>
     <w:p>
       <w:pPr>
+        <w:keepNext/>
         <w:spacing w:before="320" w:after="120"/>
       </w:pPr>
       <w:r>
@@ -60,7 +64,8 @@
     </w:p>
     <w:p>
       <w:pPr>
-        <w:spacing w:before="240" w:after="80"/>
+        <w:keepNext/>
+        <w:spacing w:before="280" w:after="80"/>
       </w:pPr>
       <w:r>
         <w:rPr>
@@ -74,7 +79,8 @@
     </w:p>
     <w:p>
       <w:pPr>
-        <w:spacing w:before="160" w:after="40"/>
+        <w:keepNext/>
+        <w:spacing w:before="200" w:after="40"/>
       </w:pPr>
       <w:r>
         <w:rPr>
@@ -99,16 +105,31 @@
         <w:gridCol w:w="2340"/>
       </w:tblGrid>
       <w:tr>
+        <w:trPr>
+          <w:trHeight w:val="280"/>
+        </w:trPr>
         <w:tc>
           <w:tcPr>
             <w:tcW w:type="dxa" w:w="2340"/>
+            <w:vAlign w:val="center"/>
+            <w:tcMar>
+              <w:top w:w="120" w:type="dxa"/>
+              <w:bottom w:w="120" w:type="dxa"/>
+              <w:left w:w="150" w:type="dxa"/>
+              <w:right w:w="150" w:type="dxa"/>
+            </w:tcMar>
             <w:shd w:fill="0F172A"/>
           </w:tcPr>
           <w:p>
+            <w:pPr>
+              <w:spacing w:before="0" w:after="0" w:line="276" w:lineRule="auto"/>
+            </w:pPr>
             <w:r>
               <w:rPr>
+                <w:rFonts w:ascii="Calibri" w:hAnsi="Calibri"/>
                 <w:b/>
                 <w:color w:val="FFFFFF"/>
+                <w:sz w:val="20"/>
               </w:rPr>
               <w:t>N°</w:t>
             </w:r>
@@ -117,13 +138,25 @@
         <w:tc>
           <w:tcPr>
             <w:tcW w:type="dxa" w:w="2340"/>
+            <w:vAlign w:val="center"/>
+            <w:tcMar>
+              <w:top w:w="120" w:type="dxa"/>
+              <w:bottom w:w="120" w:type="dxa"/>
+              <w:left w:w="150" w:type="dxa"/>
+              <w:right w:w="150" w:type="dxa"/>
+            </w:tcMar>
             <w:shd w:fill="0F172A"/>
           </w:tcPr>
           <w:p>
+            <w:pPr>
+              <w:spacing w:before="0" w:after="0" w:line="276" w:lineRule="auto"/>
+            </w:pPr>
             <w:r>
               <w:rPr>
+                <w:rFonts w:ascii="Calibri" w:hAnsi="Calibri"/>
                 <w:b/>
                 <w:color w:val="FFFFFF"/>
+                <w:sz w:val="20"/>
               </w:rPr>
               <w:t>Apellidos y Nombres</w:t>
             </w:r>
@@ -132,13 +165,25 @@
         <w:tc>
           <w:tcPr>
             <w:tcW w:type="dxa" w:w="2340"/>
+            <w:vAlign w:val="center"/>
+            <w:tcMar>
+              <w:top w:w="120" w:type="dxa"/>
+              <w:bottom w:w="120" w:type="dxa"/>
+              <w:left w:w="150" w:type="dxa"/>
+              <w:right w:w="150" w:type="dxa"/>
+            </w:tcMar>
             <w:shd w:fill="0F172A"/>
           </w:tcPr>
           <w:p>
+            <w:pPr>
+              <w:spacing w:before="0" w:after="0" w:line="276" w:lineRule="auto"/>
+            </w:pPr>
             <w:r>
               <w:rPr>
+                <w:rFonts w:ascii="Calibri" w:hAnsi="Calibri"/>
                 <w:b/>
                 <w:color w:val="FFFFFF"/>
+                <w:sz w:val="20"/>
               </w:rPr>
               <w:t>Rol en el Proyecto</w:t>
             </w:r>
@@ -147,13 +192,25 @@
         <w:tc>
           <w:tcPr>
             <w:tcW w:type="dxa" w:w="2340"/>
+            <w:vAlign w:val="center"/>
+            <w:tcMar>
+              <w:top w:w="120" w:type="dxa"/>
+              <w:bottom w:w="120" w:type="dxa"/>
+              <w:left w:w="150" w:type="dxa"/>
+              <w:right w:w="150" w:type="dxa"/>
+            </w:tcMar>
             <w:shd w:fill="0F172A"/>
           </w:tcPr>
           <w:p>
+            <w:pPr>
+              <w:spacing w:before="0" w:after="0" w:line="276" w:lineRule="auto"/>
+            </w:pPr>
             <w:r>
               <w:rPr>
+                <w:rFonts w:ascii="Calibri" w:hAnsi="Calibri"/>
                 <w:b/>
                 <w:color w:val="FFFFFF"/>
+                <w:sz w:val="20"/>
               </w:rPr>
               <w:t>Responsabilidad Técnica Principal</w:t>
             </w:r>
@@ -161,13 +218,31 @@
         </w:tc>
       </w:tr>
       <w:tr>
+        <w:trPr>
+          <w:trHeight w:val="280"/>
+        </w:trPr>
         <w:tc>
           <w:tcPr>
             <w:tcW w:type="dxa" w:w="2340"/>
+            <w:vAlign w:val="center"/>
+            <w:tcMar>
+              <w:top w:w="120" w:type="dxa"/>
+              <w:bottom w:w="120" w:type="dxa"/>
+              <w:left w:w="150" w:type="dxa"/>
+              <w:right w:w="150" w:type="dxa"/>
+            </w:tcMar>
             <w:shd w:fill="F8FAFC"/>
           </w:tcPr>
           <w:p>
+            <w:pPr>
+              <w:spacing w:before="0" w:after="0" w:line="276" w:lineRule="auto"/>
+            </w:pPr>
             <w:r>
+              <w:rPr>
+                <w:rFonts w:ascii="Calibri" w:hAnsi="Calibri"/>
+                <w:color w:val="1E293B"/>
+                <w:sz w:val="19"/>
+              </w:rPr>
               <w:t>1</w:t>
             </w:r>
           </w:p>
@@ -175,21 +250,52 @@
         <w:tc>
           <w:tcPr>
             <w:tcW w:type="dxa" w:w="2340"/>
+            <w:vAlign w:val="center"/>
+            <w:tcMar>
+              <w:top w:w="120" w:type="dxa"/>
+              <w:bottom w:w="120" w:type="dxa"/>
+              <w:left w:w="150" w:type="dxa"/>
+              <w:right w:w="150" w:type="dxa"/>
+            </w:tcMar>
             <w:shd w:fill="F8FAFC"/>
           </w:tcPr>
           <w:p>
+            <w:pPr>
+              <w:spacing w:before="0" w:after="0" w:line="276" w:lineRule="auto"/>
+            </w:pPr>
             <w:r>
-              <w:t>**Loayza Rodriguez, Lady Luz**</w:t>
+              <w:rPr>
+                <w:rFonts w:ascii="Calibri" w:hAnsi="Calibri"/>
+                <w:b/>
+                <w:color w:val="1E293B"/>
+                <w:sz w:val="19"/>
+              </w:rPr>
+              <w:t>Loayza Rodriguez, Lady Luz</w:t>
             </w:r>
           </w:p>
         </w:tc>
         <w:tc>
           <w:tcPr>
             <w:tcW w:type="dxa" w:w="2340"/>
+            <w:vAlign w:val="center"/>
+            <w:tcMar>
+              <w:top w:w="120" w:type="dxa"/>
+              <w:bottom w:w="120" w:type="dxa"/>
+              <w:left w:w="150" w:type="dxa"/>
+              <w:right w:w="150" w:type="dxa"/>
+            </w:tcMar>
             <w:shd w:fill="F8FAFC"/>
           </w:tcPr>
           <w:p>
+            <w:pPr>
+              <w:spacing w:before="0" w:after="0" w:line="276" w:lineRule="auto"/>
+            </w:pPr>
             <w:r>
+              <w:rPr>
+                <w:rFonts w:ascii="Calibri" w:hAnsi="Calibri"/>
+                <w:color w:val="1E293B"/>
+                <w:sz w:val="19"/>
+              </w:rPr>
               <w:t>Scrum Master</w:t>
             </w:r>
           </w:p>
@@ -197,22 +303,55 @@
         <w:tc>
           <w:tcPr>
             <w:tcW w:type="dxa" w:w="2340"/>
+            <w:vAlign w:val="center"/>
+            <w:tcMar>
+              <w:top w:w="120" w:type="dxa"/>
+              <w:bottom w:w="120" w:type="dxa"/>
+              <w:left w:w="150" w:type="dxa"/>
+              <w:right w:w="150" w:type="dxa"/>
+            </w:tcMar>
             <w:shd w:fill="F8FAFC"/>
           </w:tcPr>
           <w:p>
+            <w:pPr>
+              <w:spacing w:before="0" w:after="0" w:line="276" w:lineRule="auto"/>
+            </w:pPr>
             <w:r>
+              <w:rPr>
+                <w:rFonts w:ascii="Calibri" w:hAnsi="Calibri"/>
+                <w:color w:val="1E293B"/>
+                <w:sz w:val="19"/>
+              </w:rPr>
               <w:t>Coordinación general, facilitación ágil y diseño UX/UI.</w:t>
             </w:r>
           </w:p>
         </w:tc>
       </w:tr>
       <w:tr>
+        <w:trPr>
+          <w:trHeight w:val="280"/>
+        </w:trPr>
         <w:tc>
           <w:tcPr>
             <w:tcW w:type="dxa" w:w="2340"/>
+            <w:vAlign w:val="center"/>
+            <w:tcMar>
+              <w:top w:w="120" w:type="dxa"/>
+              <w:bottom w:w="120" w:type="dxa"/>
+              <w:left w:w="150" w:type="dxa"/>
+              <w:right w:w="150" w:type="dxa"/>
+            </w:tcMar>
           </w:tcPr>
           <w:p>
+            <w:pPr>
+              <w:spacing w:before="0" w:after="0" w:line="276" w:lineRule="auto"/>
+            </w:pPr>
             <w:r>
+              <w:rPr>
+                <w:rFonts w:ascii="Calibri" w:hAnsi="Calibri"/>
+                <w:color w:val="1E293B"/>
+                <w:sz w:val="19"/>
+              </w:rPr>
               <w:t>2</w:t>
             </w:r>
           </w:p>
@@ -220,19 +359,50 @@
         <w:tc>
           <w:tcPr>
             <w:tcW w:type="dxa" w:w="2340"/>
+            <w:vAlign w:val="center"/>
+            <w:tcMar>
+              <w:top w:w="120" w:type="dxa"/>
+              <w:bottom w:w="120" w:type="dxa"/>
+              <w:left w:w="150" w:type="dxa"/>
+              <w:right w:w="150" w:type="dxa"/>
+            </w:tcMar>
           </w:tcPr>
           <w:p>
+            <w:pPr>
+              <w:spacing w:before="0" w:after="0" w:line="276" w:lineRule="auto"/>
+            </w:pPr>
             <w:r>
-              <w:t>**Cárdenas Fernández, Víctor Leandro**</w:t>
+              <w:rPr>
+                <w:rFonts w:ascii="Calibri" w:hAnsi="Calibri"/>
+                <w:b/>
+                <w:color w:val="1E293B"/>
+                <w:sz w:val="19"/>
+              </w:rPr>
+              <w:t>Cárdenas Fernández, Víctor Leandro</w:t>
             </w:r>
           </w:p>
         </w:tc>
         <w:tc>
           <w:tcPr>
             <w:tcW w:type="dxa" w:w="2340"/>
+            <w:vAlign w:val="center"/>
+            <w:tcMar>
+              <w:top w:w="120" w:type="dxa"/>
+              <w:bottom w:w="120" w:type="dxa"/>
+              <w:left w:w="150" w:type="dxa"/>
+              <w:right w:w="150" w:type="dxa"/>
+            </w:tcMar>
           </w:tcPr>
           <w:p>
+            <w:pPr>
+              <w:spacing w:before="0" w:after="0" w:line="276" w:lineRule="auto"/>
+            </w:pPr>
             <w:r>
+              <w:rPr>
+                <w:rFonts w:ascii="Calibri" w:hAnsi="Calibri"/>
+                <w:color w:val="1E293B"/>
+                <w:sz w:val="19"/>
+              </w:rPr>
               <w:t>Product Owner</w:t>
             </w:r>
           </w:p>
@@ -240,22 +410,55 @@
         <w:tc>
           <w:tcPr>
             <w:tcW w:type="dxa" w:w="2340"/>
+            <w:vAlign w:val="center"/>
+            <w:tcMar>
+              <w:top w:w="120" w:type="dxa"/>
+              <w:bottom w:w="120" w:type="dxa"/>
+              <w:left w:w="150" w:type="dxa"/>
+              <w:right w:w="150" w:type="dxa"/>
+            </w:tcMar>
           </w:tcPr>
           <w:p>
+            <w:pPr>
+              <w:spacing w:before="0" w:after="0" w:line="276" w:lineRule="auto"/>
+            </w:pPr>
             <w:r>
+              <w:rPr>
+                <w:rFonts w:ascii="Calibri" w:hAnsi="Calibri"/>
+                <w:color w:val="1E293B"/>
+                <w:sz w:val="19"/>
+              </w:rPr>
               <w:t>Definición de requerimientos, arquitectura Back-End y Base de Datos.</w:t>
             </w:r>
           </w:p>
         </w:tc>
       </w:tr>
       <w:tr>
+        <w:trPr>
+          <w:trHeight w:val="280"/>
+        </w:trPr>
         <w:tc>
           <w:tcPr>
             <w:tcW w:type="dxa" w:w="2340"/>
+            <w:vAlign w:val="center"/>
+            <w:tcMar>
+              <w:top w:w="120" w:type="dxa"/>
+              <w:bottom w:w="120" w:type="dxa"/>
+              <w:left w:w="150" w:type="dxa"/>
+              <w:right w:w="150" w:type="dxa"/>
+            </w:tcMar>
             <w:shd w:fill="F8FAFC"/>
           </w:tcPr>
           <w:p>
+            <w:pPr>
+              <w:spacing w:before="0" w:after="0" w:line="276" w:lineRule="auto"/>
+            </w:pPr>
             <w:r>
+              <w:rPr>
+                <w:rFonts w:ascii="Calibri" w:hAnsi="Calibri"/>
+                <w:color w:val="1E293B"/>
+                <w:sz w:val="19"/>
+              </w:rPr>
               <w:t>3</w:t>
             </w:r>
           </w:p>
@@ -263,21 +466,52 @@
         <w:tc>
           <w:tcPr>
             <w:tcW w:type="dxa" w:w="2340"/>
+            <w:vAlign w:val="center"/>
+            <w:tcMar>
+              <w:top w:w="120" w:type="dxa"/>
+              <w:bottom w:w="120" w:type="dxa"/>
+              <w:left w:w="150" w:type="dxa"/>
+              <w:right w:w="150" w:type="dxa"/>
+            </w:tcMar>
             <w:shd w:fill="F8FAFC"/>
           </w:tcPr>
           <w:p>
+            <w:pPr>
+              <w:spacing w:before="0" w:after="0" w:line="276" w:lineRule="auto"/>
+            </w:pPr>
             <w:r>
-              <w:t>**Roman Delgado, Harley Anthony**</w:t>
+              <w:rPr>
+                <w:rFonts w:ascii="Calibri" w:hAnsi="Calibri"/>
+                <w:b/>
+                <w:color w:val="1E293B"/>
+                <w:sz w:val="19"/>
+              </w:rPr>
+              <w:t>Roman Delgado, Harley Anthony</w:t>
             </w:r>
           </w:p>
         </w:tc>
         <w:tc>
           <w:tcPr>
             <w:tcW w:type="dxa" w:w="2340"/>
+            <w:vAlign w:val="center"/>
+            <w:tcMar>
+              <w:top w:w="120" w:type="dxa"/>
+              <w:bottom w:w="120" w:type="dxa"/>
+              <w:left w:w="150" w:type="dxa"/>
+              <w:right w:w="150" w:type="dxa"/>
+            </w:tcMar>
             <w:shd w:fill="F8FAFC"/>
           </w:tcPr>
           <w:p>
+            <w:pPr>
+              <w:spacing w:before="0" w:after="0" w:line="276" w:lineRule="auto"/>
+            </w:pPr>
             <w:r>
+              <w:rPr>
+                <w:rFonts w:ascii="Calibri" w:hAnsi="Calibri"/>
+                <w:color w:val="1E293B"/>
+                <w:sz w:val="19"/>
+              </w:rPr>
               <w:t>Front-End Lead</w:t>
             </w:r>
           </w:p>
@@ -285,22 +519,55 @@
         <w:tc>
           <w:tcPr>
             <w:tcW w:type="dxa" w:w="2340"/>
+            <w:vAlign w:val="center"/>
+            <w:tcMar>
+              <w:top w:w="120" w:type="dxa"/>
+              <w:bottom w:w="120" w:type="dxa"/>
+              <w:left w:w="150" w:type="dxa"/>
+              <w:right w:w="150" w:type="dxa"/>
+            </w:tcMar>
             <w:shd w:fill="F8FAFC"/>
           </w:tcPr>
           <w:p>
+            <w:pPr>
+              <w:spacing w:before="0" w:after="0" w:line="276" w:lineRule="auto"/>
+            </w:pPr>
             <w:r>
+              <w:rPr>
+                <w:rFonts w:ascii="Calibri" w:hAnsi="Calibri"/>
+                <w:color w:val="1E293B"/>
+                <w:sz w:val="19"/>
+              </w:rPr>
               <w:t>Desarrollo de interfaz PWA, componentes React y optimización WPO.</w:t>
             </w:r>
           </w:p>
         </w:tc>
       </w:tr>
       <w:tr>
+        <w:trPr>
+          <w:trHeight w:val="280"/>
+        </w:trPr>
         <w:tc>
           <w:tcPr>
             <w:tcW w:type="dxa" w:w="2340"/>
+            <w:vAlign w:val="center"/>
+            <w:tcMar>
+              <w:top w:w="120" w:type="dxa"/>
+              <w:bottom w:w="120" w:type="dxa"/>
+              <w:left w:w="150" w:type="dxa"/>
+              <w:right w:w="150" w:type="dxa"/>
+            </w:tcMar>
           </w:tcPr>
           <w:p>
+            <w:pPr>
+              <w:spacing w:before="0" w:after="0" w:line="276" w:lineRule="auto"/>
+            </w:pPr>
             <w:r>
+              <w:rPr>
+                <w:rFonts w:ascii="Calibri" w:hAnsi="Calibri"/>
+                <w:color w:val="1E293B"/>
+                <w:sz w:val="19"/>
+              </w:rPr>
               <w:t>4</w:t>
             </w:r>
           </w:p>
@@ -308,19 +575,50 @@
         <w:tc>
           <w:tcPr>
             <w:tcW w:type="dxa" w:w="2340"/>
+            <w:vAlign w:val="center"/>
+            <w:tcMar>
+              <w:top w:w="120" w:type="dxa"/>
+              <w:bottom w:w="120" w:type="dxa"/>
+              <w:left w:w="150" w:type="dxa"/>
+              <w:right w:w="150" w:type="dxa"/>
+            </w:tcMar>
           </w:tcPr>
           <w:p>
+            <w:pPr>
+              <w:spacing w:before="0" w:after="0" w:line="276" w:lineRule="auto"/>
+            </w:pPr>
             <w:r>
-              <w:t>**Dávila Morales, Jim Alessandro**</w:t>
+              <w:rPr>
+                <w:rFonts w:ascii="Calibri" w:hAnsi="Calibri"/>
+                <w:b/>
+                <w:color w:val="1E293B"/>
+                <w:sz w:val="19"/>
+              </w:rPr>
+              <w:t>Dávila Morales, Jim Alessandro</w:t>
             </w:r>
           </w:p>
         </w:tc>
         <w:tc>
           <w:tcPr>
             <w:tcW w:type="dxa" w:w="2340"/>
+            <w:vAlign w:val="center"/>
+            <w:tcMar>
+              <w:top w:w="120" w:type="dxa"/>
+              <w:bottom w:w="120" w:type="dxa"/>
+              <w:left w:w="150" w:type="dxa"/>
+              <w:right w:w="150" w:type="dxa"/>
+            </w:tcMar>
           </w:tcPr>
           <w:p>
+            <w:pPr>
+              <w:spacing w:before="0" w:after="0" w:line="276" w:lineRule="auto"/>
+            </w:pPr>
             <w:r>
+              <w:rPr>
+                <w:rFonts w:ascii="Calibri" w:hAnsi="Calibri"/>
+                <w:color w:val="1E293B"/>
+                <w:sz w:val="19"/>
+              </w:rPr>
               <w:t>QA / DevOps</w:t>
             </w:r>
           </w:p>
@@ -328,22 +626,55 @@
         <w:tc>
           <w:tcPr>
             <w:tcW w:type="dxa" w:w="2340"/>
+            <w:vAlign w:val="center"/>
+            <w:tcMar>
+              <w:top w:w="120" w:type="dxa"/>
+              <w:bottom w:w="120" w:type="dxa"/>
+              <w:left w:w="150" w:type="dxa"/>
+              <w:right w:w="150" w:type="dxa"/>
+            </w:tcMar>
           </w:tcPr>
           <w:p>
+            <w:pPr>
+              <w:spacing w:before="0" w:after="0" w:line="276" w:lineRule="auto"/>
+            </w:pPr>
             <w:r>
+              <w:rPr>
+                <w:rFonts w:ascii="Calibri" w:hAnsi="Calibri"/>
+                <w:color w:val="1E293B"/>
+                <w:sz w:val="19"/>
+              </w:rPr>
               <w:t>Automatización de pruebas unitarias, CI/CD y aseguramiento de calidad.</w:t>
             </w:r>
           </w:p>
         </w:tc>
       </w:tr>
       <w:tr>
+        <w:trPr>
+          <w:trHeight w:val="280"/>
+        </w:trPr>
         <w:tc>
           <w:tcPr>
             <w:tcW w:type="dxa" w:w="2340"/>
+            <w:vAlign w:val="center"/>
+            <w:tcMar>
+              <w:top w:w="120" w:type="dxa"/>
+              <w:bottom w:w="120" w:type="dxa"/>
+              <w:left w:w="150" w:type="dxa"/>
+              <w:right w:w="150" w:type="dxa"/>
+            </w:tcMar>
             <w:shd w:fill="F8FAFC"/>
           </w:tcPr>
           <w:p>
+            <w:pPr>
+              <w:spacing w:before="0" w:after="0" w:line="276" w:lineRule="auto"/>
+            </w:pPr>
             <w:r>
+              <w:rPr>
+                <w:rFonts w:ascii="Calibri" w:hAnsi="Calibri"/>
+                <w:color w:val="1E293B"/>
+                <w:sz w:val="19"/>
+              </w:rPr>
               <w:t>5</w:t>
             </w:r>
           </w:p>
@@ -351,21 +682,52 @@
         <w:tc>
           <w:tcPr>
             <w:tcW w:type="dxa" w:w="2340"/>
+            <w:vAlign w:val="center"/>
+            <w:tcMar>
+              <w:top w:w="120" w:type="dxa"/>
+              <w:bottom w:w="120" w:type="dxa"/>
+              <w:left w:w="150" w:type="dxa"/>
+              <w:right w:w="150" w:type="dxa"/>
+            </w:tcMar>
             <w:shd w:fill="F8FAFC"/>
           </w:tcPr>
           <w:p>
+            <w:pPr>
+              <w:spacing w:before="0" w:after="0" w:line="276" w:lineRule="auto"/>
+            </w:pPr>
             <w:r>
-              <w:t>**Rojas Sanchez, Daniel Enrique**</w:t>
+              <w:rPr>
+                <w:rFonts w:ascii="Calibri" w:hAnsi="Calibri"/>
+                <w:b/>
+                <w:color w:val="1E293B"/>
+                <w:sz w:val="19"/>
+              </w:rPr>
+              <w:t>Rojas Sanchez, Daniel Enrique</w:t>
             </w:r>
           </w:p>
         </w:tc>
         <w:tc>
           <w:tcPr>
             <w:tcW w:type="dxa" w:w="2340"/>
+            <w:vAlign w:val="center"/>
+            <w:tcMar>
+              <w:top w:w="120" w:type="dxa"/>
+              <w:bottom w:w="120" w:type="dxa"/>
+              <w:left w:w="150" w:type="dxa"/>
+              <w:right w:w="150" w:type="dxa"/>
+            </w:tcMar>
             <w:shd w:fill="F8FAFC"/>
           </w:tcPr>
           <w:p>
+            <w:pPr>
+              <w:spacing w:before="0" w:after="0" w:line="276" w:lineRule="auto"/>
+            </w:pPr>
             <w:r>
+              <w:rPr>
+                <w:rFonts w:ascii="Calibri" w:hAnsi="Calibri"/>
+                <w:color w:val="1E293B"/>
+                <w:sz w:val="19"/>
+              </w:rPr>
               <w:t>Analista de Negocio</w:t>
             </w:r>
           </w:p>
@@ -373,20 +735,40 @@
         <w:tc>
           <w:tcPr>
             <w:tcW w:type="dxa" w:w="2340"/>
+            <w:vAlign w:val="center"/>
+            <w:tcMar>
+              <w:top w:w="120" w:type="dxa"/>
+              <w:bottom w:w="120" w:type="dxa"/>
+              <w:left w:w="150" w:type="dxa"/>
+              <w:right w:w="150" w:type="dxa"/>
+            </w:tcMar>
             <w:shd w:fill="F8FAFC"/>
           </w:tcPr>
           <w:p>
+            <w:pPr>
+              <w:spacing w:before="0" w:after="0" w:line="276" w:lineRule="auto"/>
+            </w:pPr>
             <w:r>
+              <w:rPr>
+                <w:rFonts w:ascii="Calibri" w:hAnsi="Calibri"/>
+                <w:color w:val="1E293B"/>
+                <w:sz w:val="19"/>
+              </w:rPr>
               <w:t>Levantamiento de requisitos, modelado de procesos y documentación técnica.</w:t>
             </w:r>
           </w:p>
         </w:tc>
       </w:tr>
     </w:tbl>
-    <w:p/>
     <w:p>
       <w:pPr>
-        <w:spacing w:before="160" w:after="40"/>
+        <w:spacing w:before="0" w:after="120"/>
+      </w:pPr>
+    </w:p>
+    <w:p>
+      <w:pPr>
+        <w:keepNext/>
+        <w:spacing w:before="200" w:after="40"/>
       </w:pPr>
       <w:r>
         <w:rPr>
@@ -401,51 +783,122 @@
     <w:p>
       <w:pPr>
         <w:pStyle w:val="ListBullet"/>
-        <w:spacing w:after="40"/>
+        <w:spacing w:before="20" w:after="40" w:line="276" w:lineRule="auto"/>
       </w:pPr>
       <w:r>
-        <w:t>Nombre Comercial: LeoFit Indumentaria &amp; Nutrición Deportiva.</w:t>
+        <w:rPr>
+          <w:rFonts w:ascii="Calibri" w:hAnsi="Calibri"/>
+          <w:b/>
+          <w:color w:val="1E293B"/>
+          <w:sz w:val="21"/>
+        </w:rPr>
+        <w:t>Nombre Comercial:</w:t>
+      </w:r>
+      <w:r>
+        <w:rPr>
+          <w:rFonts w:ascii="Calibri" w:hAnsi="Calibri"/>
+          <w:color w:val="1E293B"/>
+          <w:sz w:val="21"/>
+        </w:rPr>
+        <w:t xml:space="preserve"> LeoFit Indumentaria &amp; Nutrición Deportiva.</w:t>
       </w:r>
     </w:p>
     <w:p>
       <w:pPr>
         <w:pStyle w:val="ListBullet"/>
-        <w:spacing w:after="40"/>
+        <w:spacing w:before="20" w:after="40" w:line="276" w:lineRule="auto"/>
       </w:pPr>
       <w:r>
-        <w:t>Rubro Comercial: Comercialización minorista de indumentaria deportiva (conjuntos térmicos, lycras de compresión, camisetas dry-fit, fajas deportivas) y accesorios de entrenamiento.</w:t>
+        <w:rPr>
+          <w:rFonts w:ascii="Calibri" w:hAnsi="Calibri"/>
+          <w:b/>
+          <w:color w:val="1E293B"/>
+          <w:sz w:val="21"/>
+        </w:rPr>
+        <w:t>Rubro Comercial:</w:t>
+      </w:r>
+      <w:r>
+        <w:rPr>
+          <w:rFonts w:ascii="Calibri" w:hAnsi="Calibri"/>
+          <w:color w:val="1E293B"/>
+          <w:sz w:val="21"/>
+        </w:rPr>
+        <w:t xml:space="preserve"> Comercialización minorista de indumentaria deportiva (conjuntos térmicos, lycras de compresión, camisetas dry-fit, fajas deportivas) y accesorios de entrenamiento.</w:t>
       </w:r>
     </w:p>
     <w:p>
       <w:pPr>
         <w:pStyle w:val="ListBullet"/>
-        <w:spacing w:after="40"/>
+        <w:spacing w:before="20" w:after="40" w:line="276" w:lineRule="auto"/>
       </w:pPr>
       <w:r>
-        <w:t>Ubicación Geográfica: Lima Metropolitana, Perú.</w:t>
+        <w:rPr>
+          <w:rFonts w:ascii="Calibri" w:hAnsi="Calibri"/>
+          <w:b/>
+          <w:color w:val="1E293B"/>
+          <w:sz w:val="21"/>
+        </w:rPr>
+        <w:t>Ubicación Geográfica:</w:t>
+      </w:r>
+      <w:r>
+        <w:rPr>
+          <w:rFonts w:ascii="Calibri" w:hAnsi="Calibri"/>
+          <w:color w:val="1E293B"/>
+          <w:sz w:val="21"/>
+        </w:rPr>
+        <w:t xml:space="preserve"> Lima Metropolitana, Perú.</w:t>
       </w:r>
     </w:p>
     <w:p>
       <w:pPr>
         <w:pStyle w:val="ListBullet"/>
-        <w:spacing w:after="40"/>
+        <w:spacing w:before="20" w:after="40" w:line="276" w:lineRule="auto"/>
       </w:pPr>
       <w:r>
-        <w:t>Modelo de Operación: Ventas directas al consumidor (B2C) en Lima y despachos a provincias mediante agencias de encomienda.</w:t>
+        <w:rPr>
+          <w:rFonts w:ascii="Calibri" w:hAnsi="Calibri"/>
+          <w:b/>
+          <w:color w:val="1E293B"/>
+          <w:sz w:val="21"/>
+        </w:rPr>
+        <w:t>Modelo de Operación:</w:t>
+      </w:r>
+      <w:r>
+        <w:rPr>
+          <w:rFonts w:ascii="Calibri" w:hAnsi="Calibri"/>
+          <w:color w:val="1E293B"/>
+          <w:sz w:val="21"/>
+        </w:rPr>
+        <w:t xml:space="preserve"> Ventas directas al consumidor (B2C) en Lima y despachos a provincias mediante agencias de encomienda.</w:t>
       </w:r>
     </w:p>
     <w:p>
       <w:pPr>
         <w:pStyle w:val="ListBullet"/>
-        <w:spacing w:after="40"/>
+        <w:spacing w:before="20" w:after="40" w:line="276" w:lineRule="auto"/>
       </w:pPr>
       <w:r>
-        <w:t>Justificación de la Selección: LeoFit es un emprendimiento comercial independiente en fase de expansión que gestiona sus ventas de forma reactiva y no estandarizada a través de redes sociales (Facebook y WhatsApp). Representa un caso de estudio real, accesible y de alta pertinencia para la implementación de una solución de software orientada a la eficiencia operativa.</w:t>
+        <w:rPr>
+          <w:rFonts w:ascii="Calibri" w:hAnsi="Calibri"/>
+          <w:b/>
+          <w:color w:val="1E293B"/>
+          <w:sz w:val="21"/>
+        </w:rPr>
+        <w:t>Justificación de la Selección:</w:t>
+      </w:r>
+      <w:r>
+        <w:rPr>
+          <w:rFonts w:ascii="Calibri" w:hAnsi="Calibri"/>
+          <w:color w:val="1E293B"/>
+          <w:sz w:val="21"/>
+        </w:rPr>
+        <w:t xml:space="preserve"> LeoFit es un emprendimiento comercial independiente en fase de expansión que gestiona sus ventas de forma reactiva y no estandarizada a través de redes sociales (Facebook y WhatsApp). Representa un caso de estudio real, accesible y de alta pertinencia para la implementación de una solución de software orientada a la eficiencia operativa.</w:t>
       </w:r>
     </w:p>
     <w:p>
       <w:pPr>
-        <w:spacing w:before="160" w:after="40"/>
+        <w:keepNext/>
+        <w:spacing w:before="200" w:after="40"/>
       </w:pPr>
       <w:r>
         <w:rPr>
@@ -460,42 +913,99 @@
     <w:p>
       <w:pPr>
         <w:pStyle w:val="ListBullet"/>
-        <w:spacing w:after="40"/>
+        <w:spacing w:before="20" w:after="40" w:line="276" w:lineRule="auto"/>
       </w:pPr>
       <w:r>
-        <w:t>Representante y Contacto Principal: Víctor Raúl Cárdenas Ramírez.</w:t>
+        <w:rPr>
+          <w:rFonts w:ascii="Calibri" w:hAnsi="Calibri"/>
+          <w:b/>
+          <w:color w:val="1E293B"/>
+          <w:sz w:val="21"/>
+        </w:rPr>
+        <w:t>Representante y Contacto Principal:</w:t>
+      </w:r>
+      <w:r>
+        <w:rPr>
+          <w:rFonts w:ascii="Calibri" w:hAnsi="Calibri"/>
+          <w:color w:val="1E293B"/>
+          <w:sz w:val="21"/>
+        </w:rPr>
+        <w:t xml:space="preserve"> Víctor Raúl Cárdenas Ramírez.</w:t>
       </w:r>
     </w:p>
     <w:p>
       <w:pPr>
         <w:pStyle w:val="ListBullet"/>
-        <w:spacing w:after="40"/>
+        <w:spacing w:before="20" w:after="40" w:line="276" w:lineRule="auto"/>
       </w:pPr>
       <w:r>
-        <w:t>Cargo: Fundador, Gerente General y Operador Principal.</w:t>
+        <w:rPr>
+          <w:rFonts w:ascii="Calibri" w:hAnsi="Calibri"/>
+          <w:b/>
+          <w:color w:val="1E293B"/>
+          <w:sz w:val="21"/>
+        </w:rPr>
+        <w:t>Cargo:</w:t>
+      </w:r>
+      <w:r>
+        <w:rPr>
+          <w:rFonts w:ascii="Calibri" w:hAnsi="Calibri"/>
+          <w:color w:val="1E293B"/>
+          <w:sz w:val="21"/>
+        </w:rPr>
+        <w:t xml:space="preserve"> Fundador, Gerente General y Operador Principal.</w:t>
       </w:r>
     </w:p>
     <w:p>
       <w:pPr>
         <w:pStyle w:val="ListBullet"/>
-        <w:spacing w:after="40"/>
+        <w:spacing w:before="20" w:after="40" w:line="276" w:lineRule="auto"/>
       </w:pPr>
       <w:r>
-        <w:t>Disponibilidad y Compromiso: El representante ha suscrito actas de conformidad y se encuentra plenamente comprometido para participar en las sesiones semanales de Sprint Review y validación de prototipos.</w:t>
+        <w:rPr>
+          <w:rFonts w:ascii="Calibri" w:hAnsi="Calibri"/>
+          <w:b/>
+          <w:color w:val="1E293B"/>
+          <w:sz w:val="21"/>
+        </w:rPr>
+        <w:t>Disponibilidad y Compromiso:</w:t>
+      </w:r>
+      <w:r>
+        <w:rPr>
+          <w:rFonts w:ascii="Calibri" w:hAnsi="Calibri"/>
+          <w:color w:val="1E293B"/>
+          <w:sz w:val="21"/>
+        </w:rPr>
+        <w:t xml:space="preserve"> El representante ha suscrito actas de conformidad y se encuentra plenamente comprometido para participar en las sesiones semanales de Sprint Review y validación de prototipos.</w:t>
       </w:r>
     </w:p>
     <w:p>
       <w:pPr>
         <w:pStyle w:val="ListBullet"/>
-        <w:spacing w:after="40"/>
+        <w:spacing w:before="20" w:after="40" w:line="276" w:lineRule="auto"/>
       </w:pPr>
       <w:r>
-        <w:t>Evidencias Disponibles: Registros históricos en cuadernos físicos de notas, capturas anonimizadas de conversaciones de WhatsApp comercial y catálogo fotográfico actual de prendas.</w:t>
+        <w:rPr>
+          <w:rFonts w:ascii="Calibri" w:hAnsi="Calibri"/>
+          <w:b/>
+          <w:color w:val="1E293B"/>
+          <w:sz w:val="21"/>
+        </w:rPr>
+        <w:t>Evidencias Disponibles:</w:t>
+      </w:r>
+      <w:r>
+        <w:rPr>
+          <w:rFonts w:ascii="Calibri" w:hAnsi="Calibri"/>
+          <w:color w:val="1E293B"/>
+          <w:sz w:val="21"/>
+        </w:rPr>
+        <w:t xml:space="preserve"> Registros históricos en cuadernos físicos de notas, capturas anonimizadas de conversaciones de WhatsApp comercial y catálogo fotográfico actual de prendas.</w:t>
       </w:r>
     </w:p>
     <w:p>
       <w:pPr>
-        <w:spacing w:before="160" w:after="40"/>
+        <w:keepNext/>
+        <w:spacing w:before="200" w:after="40"/>
       </w:pPr>
       <w:r>
         <w:rPr>
@@ -510,32 +1020,58 @@
     <w:p>
       <w:pPr>
         <w:pStyle w:val="ListBullet"/>
-        <w:spacing w:after="40"/>
+        <w:spacing w:before="20" w:after="40" w:line="276" w:lineRule="auto"/>
       </w:pPr>
       <w:r>
-        <w:t>Proceso Crítico Seleccionado: Recepción, validación de existencias, registro y despacho de pedidos.</w:t>
+        <w:rPr>
+          <w:rFonts w:ascii="Calibri" w:hAnsi="Calibri"/>
+          <w:b/>
+          <w:color w:val="1E293B"/>
+          <w:sz w:val="21"/>
+        </w:rPr>
+        <w:t>Proceso Crítico Seleccionado:</w:t>
+      </w:r>
+      <w:r>
+        <w:rPr>
+          <w:rFonts w:ascii="Calibri" w:hAnsi="Calibri"/>
+          <w:color w:val="1E293B"/>
+          <w:sz w:val="21"/>
+        </w:rPr>
+        <w:t xml:space="preserve"> Recepción, validación de existencias, registro y despacho de pedidos.</w:t>
       </w:r>
     </w:p>
     <w:p>
       <w:pPr>
         <w:pStyle w:val="ListBullet"/>
-        <w:spacing w:after="40"/>
+        <w:spacing w:before="20" w:after="40" w:line="276" w:lineRule="auto"/>
       </w:pPr>
       <w:r>
+        <w:rPr>
+          <w:rFonts w:ascii="Calibri" w:hAnsi="Calibri"/>
+          <w:b/>
+          <w:color w:val="1E293B"/>
+          <w:sz w:val="21"/>
+        </w:rPr>
         <w:t>Definición Formal del Problema:</w:t>
       </w:r>
     </w:p>
     <w:p>
       <w:pPr>
-        <w:spacing w:after="80"/>
+        <w:spacing w:before="40" w:after="80" w:line="276" w:lineRule="auto"/>
       </w:pPr>
       <w:r>
+        <w:rPr>
+          <w:rFonts w:ascii="Calibri" w:hAnsi="Calibri"/>
+          <w:color w:val="1E293B"/>
+          <w:sz w:val="22"/>
+        </w:rPr>
         <w:t>"La gestión manual, descentralizada y reactiva de los pedidos comerciales a través de canales de mensajería informal (WhatsApp y llamadas telefónicas) en LeoFit ocasiona cuellos de botella operativos, demoras de hasta 25 minutos en la atención por cliente, quiebres de inventario no advertidos y errores en las direcciones de despacho, impactando negativamente en la rentabilidad y en la satisfacción del cliente."</w:t>
       </w:r>
     </w:p>
     <w:p>
       <w:pPr>
-        <w:spacing w:before="160" w:after="40"/>
+        <w:keepNext/>
+        <w:spacing w:before="200" w:after="40"/>
       </w:pPr>
       <w:r>
         <w:rPr>
@@ -561,16 +1097,31 @@
         <w:gridCol w:w="1872"/>
       </w:tblGrid>
       <w:tr>
+        <w:trPr>
+          <w:trHeight w:val="280"/>
+        </w:trPr>
         <w:tc>
           <w:tcPr>
             <w:tcW w:type="dxa" w:w="1872"/>
+            <w:vAlign w:val="center"/>
+            <w:tcMar>
+              <w:top w:w="120" w:type="dxa"/>
+              <w:bottom w:w="120" w:type="dxa"/>
+              <w:left w:w="150" w:type="dxa"/>
+              <w:right w:w="150" w:type="dxa"/>
+            </w:tcMar>
             <w:shd w:fill="0F172A"/>
           </w:tcPr>
           <w:p>
+            <w:pPr>
+              <w:spacing w:before="0" w:after="0" w:line="276" w:lineRule="auto"/>
+            </w:pPr>
             <w:r>
               <w:rPr>
+                <w:rFonts w:ascii="Calibri" w:hAnsi="Calibri"/>
                 <w:b/>
                 <w:color w:val="FFFFFF"/>
+                <w:sz w:val="20"/>
               </w:rPr>
               <w:t>Actor / Usuario</w:t>
             </w:r>
@@ -579,13 +1130,25 @@
         <w:tc>
           <w:tcPr>
             <w:tcW w:type="dxa" w:w="1872"/>
+            <w:vAlign w:val="center"/>
+            <w:tcMar>
+              <w:top w:w="120" w:type="dxa"/>
+              <w:bottom w:w="120" w:type="dxa"/>
+              <w:left w:w="150" w:type="dxa"/>
+              <w:right w:w="150" w:type="dxa"/>
+            </w:tcMar>
             <w:shd w:fill="0F172A"/>
           </w:tcPr>
           <w:p>
+            <w:pPr>
+              <w:spacing w:before="0" w:after="0" w:line="276" w:lineRule="auto"/>
+            </w:pPr>
             <w:r>
               <w:rPr>
+                <w:rFonts w:ascii="Calibri" w:hAnsi="Calibri"/>
                 <w:b/>
                 <w:color w:val="FFFFFF"/>
+                <w:sz w:val="20"/>
               </w:rPr>
               <w:t>Rol en el Negocio</w:t>
             </w:r>
@@ -594,13 +1157,25 @@
         <w:tc>
           <w:tcPr>
             <w:tcW w:type="dxa" w:w="1872"/>
+            <w:vAlign w:val="center"/>
+            <w:tcMar>
+              <w:top w:w="120" w:type="dxa"/>
+              <w:bottom w:w="120" w:type="dxa"/>
+              <w:left w:w="150" w:type="dxa"/>
+              <w:right w:w="150" w:type="dxa"/>
+            </w:tcMar>
             <w:shd w:fill="0F172A"/>
           </w:tcPr>
           <w:p>
+            <w:pPr>
+              <w:spacing w:before="0" w:after="0" w:line="276" w:lineRule="auto"/>
+            </w:pPr>
             <w:r>
               <w:rPr>
+                <w:rFonts w:ascii="Calibri" w:hAnsi="Calibri"/>
                 <w:b/>
                 <w:color w:val="FFFFFF"/>
+                <w:sz w:val="20"/>
               </w:rPr>
               <w:t>Necesidad Principal</w:t>
             </w:r>
@@ -609,13 +1184,25 @@
         <w:tc>
           <w:tcPr>
             <w:tcW w:type="dxa" w:w="1872"/>
+            <w:vAlign w:val="center"/>
+            <w:tcMar>
+              <w:top w:w="120" w:type="dxa"/>
+              <w:bottom w:w="120" w:type="dxa"/>
+              <w:left w:w="150" w:type="dxa"/>
+              <w:right w:w="150" w:type="dxa"/>
+            </w:tcMar>
             <w:shd w:fill="0F172A"/>
           </w:tcPr>
           <w:p>
+            <w:pPr>
+              <w:spacing w:before="0" w:after="0" w:line="276" w:lineRule="auto"/>
+            </w:pPr>
             <w:r>
               <w:rPr>
+                <w:rFonts w:ascii="Calibri" w:hAnsi="Calibri"/>
                 <w:b/>
                 <w:color w:val="FFFFFF"/>
+                <w:sz w:val="20"/>
               </w:rPr>
               <w:t>Dificultad Actual</w:t>
             </w:r>
@@ -624,13 +1211,25 @@
         <w:tc>
           <w:tcPr>
             <w:tcW w:type="dxa" w:w="1872"/>
+            <w:vAlign w:val="center"/>
+            <w:tcMar>
+              <w:top w:w="120" w:type="dxa"/>
+              <w:bottom w:w="120" w:type="dxa"/>
+              <w:left w:w="150" w:type="dxa"/>
+              <w:right w:w="150" w:type="dxa"/>
+            </w:tcMar>
             <w:shd w:fill="0F172A"/>
           </w:tcPr>
           <w:p>
+            <w:pPr>
+              <w:spacing w:before="0" w:after="0" w:line="276" w:lineRule="auto"/>
+            </w:pPr>
             <w:r>
               <w:rPr>
+                <w:rFonts w:ascii="Calibri" w:hAnsi="Calibri"/>
                 <w:b/>
                 <w:color w:val="FFFFFF"/>
+                <w:sz w:val="20"/>
               </w:rPr>
               <w:t>Validación Propuesta</w:t>
             </w:r>
@@ -638,24 +1237,58 @@
         </w:tc>
       </w:tr>
       <w:tr>
+        <w:trPr>
+          <w:trHeight w:val="280"/>
+        </w:trPr>
         <w:tc>
           <w:tcPr>
             <w:tcW w:type="dxa" w:w="1872"/>
+            <w:vAlign w:val="center"/>
+            <w:tcMar>
+              <w:top w:w="120" w:type="dxa"/>
+              <w:bottom w:w="120" w:type="dxa"/>
+              <w:left w:w="150" w:type="dxa"/>
+              <w:right w:w="150" w:type="dxa"/>
+            </w:tcMar>
             <w:shd w:fill="F8FAFC"/>
           </w:tcPr>
           <w:p>
+            <w:pPr>
+              <w:spacing w:before="0" w:after="0" w:line="276" w:lineRule="auto"/>
+            </w:pPr>
             <w:r>
-              <w:t>**Víctor Raúl Cárdenas**</w:t>
+              <w:rPr>
+                <w:rFonts w:ascii="Calibri" w:hAnsi="Calibri"/>
+                <w:b/>
+                <w:color w:val="1E293B"/>
+                <w:sz w:val="19"/>
+              </w:rPr>
+              <w:t>Víctor Raúl Cárdenas</w:t>
             </w:r>
           </w:p>
         </w:tc>
         <w:tc>
           <w:tcPr>
             <w:tcW w:type="dxa" w:w="1872"/>
+            <w:vAlign w:val="center"/>
+            <w:tcMar>
+              <w:top w:w="120" w:type="dxa"/>
+              <w:bottom w:w="120" w:type="dxa"/>
+              <w:left w:w="150" w:type="dxa"/>
+              <w:right w:w="150" w:type="dxa"/>
+            </w:tcMar>
             <w:shd w:fill="F8FAFC"/>
           </w:tcPr>
           <w:p>
+            <w:pPr>
+              <w:spacing w:before="0" w:after="0" w:line="276" w:lineRule="auto"/>
+            </w:pPr>
             <w:r>
+              <w:rPr>
+                <w:rFonts w:ascii="Calibri" w:hAnsi="Calibri"/>
+                <w:color w:val="1E293B"/>
+                <w:sz w:val="19"/>
+              </w:rPr>
               <w:t>Administrador / Dueño</w:t>
             </w:r>
           </w:p>
@@ -663,10 +1296,25 @@
         <w:tc>
           <w:tcPr>
             <w:tcW w:type="dxa" w:w="1872"/>
+            <w:vAlign w:val="center"/>
+            <w:tcMar>
+              <w:top w:w="120" w:type="dxa"/>
+              <w:bottom w:w="120" w:type="dxa"/>
+              <w:left w:w="150" w:type="dxa"/>
+              <w:right w:w="150" w:type="dxa"/>
+            </w:tcMar>
             <w:shd w:fill="F8FAFC"/>
           </w:tcPr>
           <w:p>
+            <w:pPr>
+              <w:spacing w:before="0" w:after="0" w:line="276" w:lineRule="auto"/>
+            </w:pPr>
             <w:r>
+              <w:rPr>
+                <w:rFonts w:ascii="Calibri" w:hAnsi="Calibri"/>
+                <w:color w:val="1E293B"/>
+                <w:sz w:val="19"/>
+              </w:rPr>
               <w:t>Centralizar pedidos, controlar stock en tiempo real y actualizar estados de entrega con un clic.</w:t>
             </w:r>
           </w:p>
@@ -674,10 +1322,25 @@
         <w:tc>
           <w:tcPr>
             <w:tcW w:type="dxa" w:w="1872"/>
+            <w:vAlign w:val="center"/>
+            <w:tcMar>
+              <w:top w:w="120" w:type="dxa"/>
+              <w:bottom w:w="120" w:type="dxa"/>
+              <w:left w:w="150" w:type="dxa"/>
+              <w:right w:w="150" w:type="dxa"/>
+            </w:tcMar>
             <w:shd w:fill="F8FAFC"/>
           </w:tcPr>
           <w:p>
+            <w:pPr>
+              <w:spacing w:before="0" w:after="0" w:line="276" w:lineRule="auto"/>
+            </w:pPr>
             <w:r>
+              <w:rPr>
+                <w:rFonts w:ascii="Calibri" w:hAnsi="Calibri"/>
+                <w:color w:val="1E293B"/>
+                <w:sz w:val="19"/>
+              </w:rPr>
               <w:t>Sobrecarga de trabajo operativo, errores de registro manuscrito y falta de trazabilidad.</w:t>
             </w:r>
           </w:p>
@@ -685,32 +1348,81 @@
         <w:tc>
           <w:tcPr>
             <w:tcW w:type="dxa" w:w="1872"/>
+            <w:vAlign w:val="center"/>
+            <w:tcMar>
+              <w:top w:w="120" w:type="dxa"/>
+              <w:bottom w:w="120" w:type="dxa"/>
+              <w:left w:w="150" w:type="dxa"/>
+              <w:right w:w="150" w:type="dxa"/>
+            </w:tcMar>
             <w:shd w:fill="F8FAFC"/>
           </w:tcPr>
           <w:p>
+            <w:pPr>
+              <w:spacing w:before="0" w:after="0" w:line="276" w:lineRule="auto"/>
+            </w:pPr>
             <w:r>
+              <w:rPr>
+                <w:rFonts w:ascii="Calibri" w:hAnsi="Calibri"/>
+                <w:color w:val="1E293B"/>
+                <w:sz w:val="19"/>
+              </w:rPr>
               <w:t>Pruebas de usabilidad del panel administrativo y flujo de pedidos en vivo.</w:t>
             </w:r>
           </w:p>
         </w:tc>
       </w:tr>
       <w:tr>
+        <w:trPr>
+          <w:trHeight w:val="280"/>
+        </w:trPr>
         <w:tc>
           <w:tcPr>
             <w:tcW w:type="dxa" w:w="1872"/>
+            <w:vAlign w:val="center"/>
+            <w:tcMar>
+              <w:top w:w="120" w:type="dxa"/>
+              <w:bottom w:w="120" w:type="dxa"/>
+              <w:left w:w="150" w:type="dxa"/>
+              <w:right w:w="150" w:type="dxa"/>
+            </w:tcMar>
           </w:tcPr>
           <w:p>
+            <w:pPr>
+              <w:spacing w:before="0" w:after="0" w:line="276" w:lineRule="auto"/>
+            </w:pPr>
             <w:r>
-              <w:t>**Cliente Deportivo**</w:t>
+              <w:rPr>
+                <w:rFonts w:ascii="Calibri" w:hAnsi="Calibri"/>
+                <w:b/>
+                <w:color w:val="1E293B"/>
+                <w:sz w:val="19"/>
+              </w:rPr>
+              <w:t>Cliente Deportivo</w:t>
             </w:r>
           </w:p>
         </w:tc>
         <w:tc>
           <w:tcPr>
             <w:tcW w:type="dxa" w:w="1872"/>
+            <w:vAlign w:val="center"/>
+            <w:tcMar>
+              <w:top w:w="120" w:type="dxa"/>
+              <w:bottom w:w="120" w:type="dxa"/>
+              <w:left w:w="150" w:type="dxa"/>
+              <w:right w:w="150" w:type="dxa"/>
+            </w:tcMar>
           </w:tcPr>
           <w:p>
+            <w:pPr>
+              <w:spacing w:before="0" w:after="0" w:line="276" w:lineRule="auto"/>
+            </w:pPr>
             <w:r>
+              <w:rPr>
+                <w:rFonts w:ascii="Calibri" w:hAnsi="Calibri"/>
+                <w:color w:val="1E293B"/>
+                <w:sz w:val="19"/>
+              </w:rPr>
               <w:t>Comprador final</w:t>
             </w:r>
           </w:p>
@@ -718,19 +1430,66 @@
         <w:tc>
           <w:tcPr>
             <w:tcW w:type="dxa" w:w="1872"/>
+            <w:vAlign w:val="center"/>
+            <w:tcMar>
+              <w:top w:w="120" w:type="dxa"/>
+              <w:bottom w:w="120" w:type="dxa"/>
+              <w:left w:w="150" w:type="dxa"/>
+              <w:right w:w="150" w:type="dxa"/>
+            </w:tcMar>
           </w:tcPr>
           <w:p>
+            <w:pPr>
+              <w:spacing w:before="0" w:after="0" w:line="276" w:lineRule="auto"/>
+            </w:pPr>
             <w:r>
-              <w:t>Explorar prendas con tallas y precios actualizados, calcular totales y confirmar su orden en $&lt; 2$ minutos.</w:t>
+              <w:rPr>
+                <w:rFonts w:ascii="Calibri" w:hAnsi="Calibri"/>
+                <w:color w:val="1E293B"/>
+                <w:sz w:val="19"/>
+              </w:rPr>
+              <w:t xml:space="preserve">Explorar prendas con tallas y precios actualizados, calcular totales y confirmar su orden en </w:t>
+            </w:r>
+            <w:r>
+              <w:rPr>
+                <w:rFonts w:ascii="Calibri" w:hAnsi="Calibri"/>
+                <w:i/>
+                <w:color w:val="1E293B"/>
+                <w:sz w:val="19"/>
+              </w:rPr>
+              <w:t>&lt; 2</w:t>
+            </w:r>
+            <w:r>
+              <w:rPr>
+                <w:rFonts w:ascii="Calibri" w:hAnsi="Calibri"/>
+                <w:color w:val="1E293B"/>
+                <w:sz w:val="19"/>
+              </w:rPr>
+              <w:t xml:space="preserve"> minutos.</w:t>
             </w:r>
           </w:p>
         </w:tc>
         <w:tc>
           <w:tcPr>
             <w:tcW w:type="dxa" w:w="1872"/>
+            <w:vAlign w:val="center"/>
+            <w:tcMar>
+              <w:top w:w="120" w:type="dxa"/>
+              <w:bottom w:w="120" w:type="dxa"/>
+              <w:left w:w="150" w:type="dxa"/>
+              <w:right w:w="150" w:type="dxa"/>
+            </w:tcMar>
           </w:tcPr>
           <w:p>
+            <w:pPr>
+              <w:spacing w:before="0" w:after="0" w:line="276" w:lineRule="auto"/>
+            </w:pPr>
             <w:r>
+              <w:rPr>
+                <w:rFonts w:ascii="Calibri" w:hAnsi="Calibri"/>
+                <w:color w:val="1E293B"/>
+                <w:sz w:val="19"/>
+              </w:rPr>
               <w:t>Respuestas demoradas por chat, falta de catálogo ordenado y desconocimiento del estado de entrega.</w:t>
             </w:r>
           </w:p>
@@ -738,33 +1497,82 @@
         <w:tc>
           <w:tcPr>
             <w:tcW w:type="dxa" w:w="1872"/>
+            <w:vAlign w:val="center"/>
+            <w:tcMar>
+              <w:top w:w="120" w:type="dxa"/>
+              <w:bottom w:w="120" w:type="dxa"/>
+              <w:left w:w="150" w:type="dxa"/>
+              <w:right w:w="150" w:type="dxa"/>
+            </w:tcMar>
           </w:tcPr>
           <w:p>
+            <w:pPr>
+              <w:spacing w:before="0" w:after="0" w:line="276" w:lineRule="auto"/>
+            </w:pPr>
             <w:r>
+              <w:rPr>
+                <w:rFonts w:ascii="Calibri" w:hAnsi="Calibri"/>
+                <w:color w:val="1E293B"/>
+                <w:sz w:val="19"/>
+              </w:rPr>
               <w:t>Tasa de conversión de pedidos y reducción del tiempo de espera.</w:t>
             </w:r>
           </w:p>
         </w:tc>
       </w:tr>
       <w:tr>
+        <w:trPr>
+          <w:trHeight w:val="280"/>
+        </w:trPr>
         <w:tc>
           <w:tcPr>
             <w:tcW w:type="dxa" w:w="1872"/>
+            <w:vAlign w:val="center"/>
+            <w:tcMar>
+              <w:top w:w="120" w:type="dxa"/>
+              <w:bottom w:w="120" w:type="dxa"/>
+              <w:left w:w="150" w:type="dxa"/>
+              <w:right w:w="150" w:type="dxa"/>
+            </w:tcMar>
             <w:shd w:fill="F8FAFC"/>
           </w:tcPr>
           <w:p>
+            <w:pPr>
+              <w:spacing w:before="0" w:after="0" w:line="276" w:lineRule="auto"/>
+            </w:pPr>
             <w:r>
-              <w:t>**Equipo de Proyecto**</w:t>
+              <w:rPr>
+                <w:rFonts w:ascii="Calibri" w:hAnsi="Calibri"/>
+                <w:b/>
+                <w:color w:val="1E293B"/>
+                <w:sz w:val="19"/>
+              </w:rPr>
+              <w:t>Equipo de Proyecto</w:t>
             </w:r>
           </w:p>
         </w:tc>
         <w:tc>
           <w:tcPr>
             <w:tcW w:type="dxa" w:w="1872"/>
+            <w:vAlign w:val="center"/>
+            <w:tcMar>
+              <w:top w:w="120" w:type="dxa"/>
+              <w:bottom w:w="120" w:type="dxa"/>
+              <w:left w:w="150" w:type="dxa"/>
+              <w:right w:w="150" w:type="dxa"/>
+            </w:tcMar>
             <w:shd w:fill="F8FAFC"/>
           </w:tcPr>
           <w:p>
+            <w:pPr>
+              <w:spacing w:before="0" w:after="0" w:line="276" w:lineRule="auto"/>
+            </w:pPr>
             <w:r>
+              <w:rPr>
+                <w:rFonts w:ascii="Calibri" w:hAnsi="Calibri"/>
+                <w:color w:val="1E293B"/>
+                <w:sz w:val="19"/>
+              </w:rPr>
               <w:t>Desarrolladores UTP</w:t>
             </w:r>
           </w:p>
@@ -772,10 +1580,25 @@
         <w:tc>
           <w:tcPr>
             <w:tcW w:type="dxa" w:w="1872"/>
+            <w:vAlign w:val="center"/>
+            <w:tcMar>
+              <w:top w:w="120" w:type="dxa"/>
+              <w:bottom w:w="120" w:type="dxa"/>
+              <w:left w:w="150" w:type="dxa"/>
+              <w:right w:w="150" w:type="dxa"/>
+            </w:tcMar>
             <w:shd w:fill="F8FAFC"/>
           </w:tcPr>
           <w:p>
+            <w:pPr>
+              <w:spacing w:before="0" w:after="0" w:line="276" w:lineRule="auto"/>
+            </w:pPr>
             <w:r>
+              <w:rPr>
+                <w:rFonts w:ascii="Calibri" w:hAnsi="Calibri"/>
+                <w:color w:val="1E293B"/>
+                <w:sz w:val="19"/>
+              </w:rPr>
               <w:t>Requerimientos técnicos claros, acceso a datos sintéticos y retroalimentación iterativa.</w:t>
             </w:r>
           </w:p>
@@ -783,10 +1606,25 @@
         <w:tc>
           <w:tcPr>
             <w:tcW w:type="dxa" w:w="1872"/>
+            <w:vAlign w:val="center"/>
+            <w:tcMar>
+              <w:top w:w="120" w:type="dxa"/>
+              <w:bottom w:w="120" w:type="dxa"/>
+              <w:left w:w="150" w:type="dxa"/>
+              <w:right w:w="150" w:type="dxa"/>
+            </w:tcMar>
             <w:shd w:fill="F8FAFC"/>
           </w:tcPr>
           <w:p>
+            <w:pPr>
+              <w:spacing w:before="0" w:after="0" w:line="276" w:lineRule="auto"/>
+            </w:pPr>
             <w:r>
+              <w:rPr>
+                <w:rFonts w:ascii="Calibri" w:hAnsi="Calibri"/>
+                <w:color w:val="1E293B"/>
+                <w:sz w:val="19"/>
+              </w:rPr>
               <w:t>Tiempo limitado del stakeholder por su dedicación a la operación diaria.</w:t>
             </w:r>
           </w:p>
@@ -794,20 +1632,40 @@
         <w:tc>
           <w:tcPr>
             <w:tcW w:type="dxa" w:w="1872"/>
+            <w:vAlign w:val="center"/>
+            <w:tcMar>
+              <w:top w:w="120" w:type="dxa"/>
+              <w:bottom w:w="120" w:type="dxa"/>
+              <w:left w:w="150" w:type="dxa"/>
+              <w:right w:w="150" w:type="dxa"/>
+            </w:tcMar>
             <w:shd w:fill="F8FAFC"/>
           </w:tcPr>
           <w:p>
+            <w:pPr>
+              <w:spacing w:before="0" w:after="0" w:line="276" w:lineRule="auto"/>
+            </w:pPr>
             <w:r>
+              <w:rPr>
+                <w:rFonts w:ascii="Calibri" w:hAnsi="Calibri"/>
+                <w:color w:val="1E293B"/>
+                <w:sz w:val="19"/>
+              </w:rPr>
               <w:t>Sesiones semanales de Sprint Review estructuradas de 30 minutos.</w:t>
             </w:r>
           </w:p>
         </w:tc>
       </w:tr>
     </w:tbl>
-    <w:p/>
     <w:p>
       <w:pPr>
-        <w:spacing w:before="160" w:after="40"/>
+        <w:spacing w:before="0" w:after="120"/>
+      </w:pPr>
+    </w:p>
+    <w:p>
+      <w:pPr>
+        <w:keepNext/>
+        <w:spacing w:before="200" w:after="40"/>
       </w:pPr>
       <w:r>
         <w:rPr>
@@ -822,64 +1680,240 @@
     <w:p>
       <w:pPr>
         <w:pStyle w:val="ListBullet"/>
-        <w:spacing w:after="40"/>
+        <w:spacing w:before="20" w:after="40" w:line="276" w:lineRule="auto"/>
       </w:pPr>
       <w:r>
-        <w:t>Tipo de Solución: Sistema Web Progresivo (PWA) responsivo, accesible desde navegadores móviles y de escritorio sin requerir descargas pesadas desde tiendas de aplicaciones.</w:t>
+        <w:rPr>
+          <w:rFonts w:ascii="Calibri" w:hAnsi="Calibri"/>
+          <w:b/>
+          <w:color w:val="1E293B"/>
+          <w:sz w:val="21"/>
+        </w:rPr>
+        <w:t>Tipo de Solución:</w:t>
+      </w:r>
+      <w:r>
+        <w:rPr>
+          <w:rFonts w:ascii="Calibri" w:hAnsi="Calibri"/>
+          <w:color w:val="1E293B"/>
+          <w:sz w:val="21"/>
+        </w:rPr>
+        <w:t xml:space="preserve"> Sistema Web Progresivo (PWA) responsivo, accesible desde navegadores móviles y de escritorio sin requerir descargas pesadas desde tiendas de aplicaciones.</w:t>
       </w:r>
     </w:p>
     <w:p>
       <w:pPr>
         <w:pStyle w:val="ListBullet"/>
-        <w:spacing w:after="40"/>
+        <w:spacing w:before="20" w:after="40" w:line="276" w:lineRule="auto"/>
       </w:pPr>
       <w:r>
+        <w:rPr>
+          <w:rFonts w:ascii="Calibri" w:hAnsi="Calibri"/>
+          <w:b/>
+          <w:color w:val="1E293B"/>
+          <w:sz w:val="21"/>
+        </w:rPr>
         <w:t>Cinco Funcionalidades Principales del MVP:</w:t>
       </w:r>
     </w:p>
     <w:p>
       <w:pPr>
-        <w:spacing w:after="80"/>
+        <w:pStyle w:val="ListNumber"/>
+        <w:spacing w:before="20" w:after="40" w:line="276" w:lineRule="auto"/>
       </w:pPr>
       <w:r>
-        <w:t>1. Catálogo Interactivo: Visualización reactiva con filtros dinámicos por categoría, talla, color y precio.</w:t>
+        <w:rPr>
+          <w:rFonts w:ascii="Calibri" w:hAnsi="Calibri"/>
+          <w:i/>
+          <w:color w:val="1E293B"/>
+          <w:sz w:val="21"/>
+        </w:rPr>
+        <w:t>Catálogo Interactivo:</w:t>
+      </w:r>
+      <w:r>
+        <w:rPr>
+          <w:rFonts w:ascii="Calibri" w:hAnsi="Calibri"/>
+          <w:color w:val="1E293B"/>
+          <w:sz w:val="21"/>
+        </w:rPr>
+        <w:t xml:space="preserve"> Visualización reactiva con filtros dinámicos por categoría, talla, color y precio.</w:t>
       </w:r>
     </w:p>
     <w:p>
       <w:pPr>
-        <w:spacing w:after="80"/>
+        <w:pStyle w:val="ListNumber"/>
+        <w:spacing w:before="20" w:after="40" w:line="276" w:lineRule="auto"/>
       </w:pPr>
       <w:r>
-        <w:t>2. Carrito de Compras y Control de Stock: Cálculo automático de importes y bloqueo de pedidos que excedan existencias reales.</w:t>
+        <w:rPr>
+          <w:rFonts w:ascii="Calibri" w:hAnsi="Calibri"/>
+          <w:i/>
+          <w:color w:val="1E293B"/>
+          <w:sz w:val="21"/>
+        </w:rPr>
+        <w:t>Carrito de Compras y Control de Stock:</w:t>
+      </w:r>
+      <w:r>
+        <w:rPr>
+          <w:rFonts w:ascii="Calibri" w:hAnsi="Calibri"/>
+          <w:color w:val="1E293B"/>
+          <w:sz w:val="21"/>
+        </w:rPr>
+        <w:t xml:space="preserve"> Cálculo automático de importes y bloqueo de pedidos que excedan existencias reales.</w:t>
       </w:r>
     </w:p>
     <w:p>
       <w:pPr>
-        <w:spacing w:after="80"/>
+        <w:pStyle w:val="ListNumber"/>
+        <w:spacing w:before="20" w:after="40" w:line="276" w:lineRule="auto"/>
       </w:pPr>
       <w:r>
-        <w:t>3. Toma y Registro Formal de Pedidos: Formulario validado con generación automática de código identificador único de orden.</w:t>
+        <w:rPr>
+          <w:rFonts w:ascii="Calibri" w:hAnsi="Calibri"/>
+          <w:i/>
+          <w:color w:val="1E293B"/>
+          <w:sz w:val="21"/>
+        </w:rPr>
+        <w:t>Toma y Registro Formal de Pedidos:</w:t>
+      </w:r>
+      <w:r>
+        <w:rPr>
+          <w:rFonts w:ascii="Calibri" w:hAnsi="Calibri"/>
+          <w:color w:val="1E293B"/>
+          <w:sz w:val="21"/>
+        </w:rPr>
+        <w:t xml:space="preserve"> Formulario validado con generación automática de código identificador único de orden.</w:t>
       </w:r>
     </w:p>
     <w:p>
       <w:pPr>
-        <w:spacing w:after="80"/>
+        <w:pStyle w:val="ListNumber"/>
+        <w:spacing w:before="20" w:after="40" w:line="276" w:lineRule="auto"/>
       </w:pPr>
       <w:r>
-        <w:t>4. Módulo de Trazabilidad de Estados: Cambio de estados operativo (`Recibido`, `En Preparación`, `En Camino`, `Entregado`, `Cancelado`).</w:t>
+        <w:rPr>
+          <w:rFonts w:ascii="Calibri" w:hAnsi="Calibri"/>
+          <w:i/>
+          <w:color w:val="1E293B"/>
+          <w:sz w:val="21"/>
+        </w:rPr>
+        <w:t>Módulo de Trazabilidad de Estados:</w:t>
+      </w:r>
+      <w:r>
+        <w:rPr>
+          <w:rFonts w:ascii="Calibri" w:hAnsi="Calibri"/>
+          <w:color w:val="1E293B"/>
+          <w:sz w:val="21"/>
+        </w:rPr>
+        <w:t xml:space="preserve"> Cambio de estados operativo (</w:t>
+      </w:r>
+      <w:r>
+        <w:rPr>
+          <w:rFonts w:ascii="Consolas" w:hAnsi="Consolas"/>
+          <w:color w:val="C2410C"/>
+          <w:sz w:val="19"/>
+        </w:rPr>
+        <w:t>Recibido</w:t>
+      </w:r>
+      <w:r>
+        <w:rPr>
+          <w:rFonts w:ascii="Calibri" w:hAnsi="Calibri"/>
+          <w:color w:val="1E293B"/>
+          <w:sz w:val="21"/>
+        </w:rPr>
+        <w:t xml:space="preserve">, </w:t>
+      </w:r>
+      <w:r>
+        <w:rPr>
+          <w:rFonts w:ascii="Consolas" w:hAnsi="Consolas"/>
+          <w:color w:val="C2410C"/>
+          <w:sz w:val="19"/>
+        </w:rPr>
+        <w:t>En Preparación</w:t>
+      </w:r>
+      <w:r>
+        <w:rPr>
+          <w:rFonts w:ascii="Calibri" w:hAnsi="Calibri"/>
+          <w:color w:val="1E293B"/>
+          <w:sz w:val="21"/>
+        </w:rPr>
+        <w:t xml:space="preserve">, </w:t>
+      </w:r>
+      <w:r>
+        <w:rPr>
+          <w:rFonts w:ascii="Consolas" w:hAnsi="Consolas"/>
+          <w:color w:val="C2410C"/>
+          <w:sz w:val="19"/>
+        </w:rPr>
+        <w:t>En Camino</w:t>
+      </w:r>
+      <w:r>
+        <w:rPr>
+          <w:rFonts w:ascii="Calibri" w:hAnsi="Calibri"/>
+          <w:color w:val="1E293B"/>
+          <w:sz w:val="21"/>
+        </w:rPr>
+        <w:t xml:space="preserve">, </w:t>
+      </w:r>
+      <w:r>
+        <w:rPr>
+          <w:rFonts w:ascii="Consolas" w:hAnsi="Consolas"/>
+          <w:color w:val="C2410C"/>
+          <w:sz w:val="19"/>
+        </w:rPr>
+        <w:t>Entregado</w:t>
+      </w:r>
+      <w:r>
+        <w:rPr>
+          <w:rFonts w:ascii="Calibri" w:hAnsi="Calibri"/>
+          <w:color w:val="1E293B"/>
+          <w:sz w:val="21"/>
+        </w:rPr>
+        <w:t xml:space="preserve">, </w:t>
+      </w:r>
+      <w:r>
+        <w:rPr>
+          <w:rFonts w:ascii="Consolas" w:hAnsi="Consolas"/>
+          <w:color w:val="C2410C"/>
+          <w:sz w:val="19"/>
+        </w:rPr>
+        <w:t>Cancelado</w:t>
+      </w:r>
+      <w:r>
+        <w:rPr>
+          <w:rFonts w:ascii="Calibri" w:hAnsi="Calibri"/>
+          <w:color w:val="1E293B"/>
+          <w:sz w:val="21"/>
+        </w:rPr>
+        <w:t>).</w:t>
       </w:r>
     </w:p>
     <w:p>
       <w:pPr>
-        <w:spacing w:after="80"/>
+        <w:pStyle w:val="ListNumber"/>
+        <w:spacing w:before="20" w:after="40" w:line="276" w:lineRule="auto"/>
       </w:pPr>
       <w:r>
-        <w:t>5. Dashboard Administrativo: Indicadores cuantitativos en tiempo real de ventas de la jornada, pedidos pendientes y alertas de stock bajo.</w:t>
+        <w:rPr>
+          <w:rFonts w:ascii="Calibri" w:hAnsi="Calibri"/>
+          <w:i/>
+          <w:color w:val="1E293B"/>
+          <w:sz w:val="21"/>
+        </w:rPr>
+        <w:t>Dashboard Administrativo:</w:t>
+      </w:r>
+      <w:r>
+        <w:rPr>
+          <w:rFonts w:ascii="Calibri" w:hAnsi="Calibri"/>
+          <w:color w:val="1E293B"/>
+          <w:sz w:val="21"/>
+        </w:rPr>
+        <w:t xml:space="preserve"> Indicadores cuantitativos en tiempo real de ventas de la jornada, pedidos pendientes y alertas de stock bajo.</w:t>
       </w:r>
     </w:p>
     <w:p>
       <w:pPr>
-        <w:spacing w:before="160" w:after="40"/>
+        <w:keepNext/>
+        <w:spacing w:before="200" w:after="40"/>
       </w:pPr>
       <w:r>
         <w:rPr>
@@ -903,16 +1937,31 @@
         <w:gridCol w:w="3120"/>
       </w:tblGrid>
       <w:tr>
+        <w:trPr>
+          <w:trHeight w:val="280"/>
+        </w:trPr>
         <w:tc>
           <w:tcPr>
             <w:tcW w:type="dxa" w:w="3120"/>
+            <w:vAlign w:val="center"/>
+            <w:tcMar>
+              <w:top w:w="120" w:type="dxa"/>
+              <w:bottom w:w="120" w:type="dxa"/>
+              <w:left w:w="150" w:type="dxa"/>
+              <w:right w:w="150" w:type="dxa"/>
+            </w:tcMar>
             <w:shd w:fill="0F172A"/>
           </w:tcPr>
           <w:p>
+            <w:pPr>
+              <w:spacing w:before="0" w:after="0" w:line="276" w:lineRule="auto"/>
+            </w:pPr>
             <w:r>
               <w:rPr>
+                <w:rFonts w:ascii="Calibri" w:hAnsi="Calibri"/>
                 <w:b/>
                 <w:color w:val="FFFFFF"/>
+                <w:sz w:val="20"/>
               </w:rPr>
               <w:t>Criterio de Viabilidad</w:t>
             </w:r>
@@ -921,13 +1970,25 @@
         <w:tc>
           <w:tcPr>
             <w:tcW w:type="dxa" w:w="3120"/>
+            <w:vAlign w:val="center"/>
+            <w:tcMar>
+              <w:top w:w="120" w:type="dxa"/>
+              <w:bottom w:w="120" w:type="dxa"/>
+              <w:left w:w="150" w:type="dxa"/>
+              <w:right w:w="150" w:type="dxa"/>
+            </w:tcMar>
             <w:shd w:fill="0F172A"/>
           </w:tcPr>
           <w:p>
+            <w:pPr>
+              <w:spacing w:before="0" w:after="0" w:line="276" w:lineRule="auto"/>
+            </w:pPr>
             <w:r>
               <w:rPr>
+                <w:rFonts w:ascii="Calibri" w:hAnsi="Calibri"/>
                 <w:b/>
                 <w:color w:val="FFFFFF"/>
+                <w:sz w:val="20"/>
               </w:rPr>
               <w:t>Evaluación</w:t>
             </w:r>
@@ -936,13 +1997,25 @@
         <w:tc>
           <w:tcPr>
             <w:tcW w:type="dxa" w:w="3120"/>
+            <w:vAlign w:val="center"/>
+            <w:tcMar>
+              <w:top w:w="120" w:type="dxa"/>
+              <w:bottom w:w="120" w:type="dxa"/>
+              <w:left w:w="150" w:type="dxa"/>
+              <w:right w:w="150" w:type="dxa"/>
+            </w:tcMar>
             <w:shd w:fill="0F172A"/>
           </w:tcPr>
           <w:p>
+            <w:pPr>
+              <w:spacing w:before="0" w:after="0" w:line="276" w:lineRule="auto"/>
+            </w:pPr>
             <w:r>
               <w:rPr>
+                <w:rFonts w:ascii="Calibri" w:hAnsi="Calibri"/>
                 <w:b/>
                 <w:color w:val="FFFFFF"/>
+                <w:sz w:val="20"/>
               </w:rPr>
               <w:t>Sustentación Técnica</w:t>
             </w:r>
@@ -950,24 +2023,58 @@
         </w:tc>
       </w:tr>
       <w:tr>
+        <w:trPr>
+          <w:trHeight w:val="280"/>
+        </w:trPr>
         <w:tc>
           <w:tcPr>
             <w:tcW w:type="dxa" w:w="3120"/>
+            <w:vAlign w:val="center"/>
+            <w:tcMar>
+              <w:top w:w="120" w:type="dxa"/>
+              <w:bottom w:w="120" w:type="dxa"/>
+              <w:left w:w="150" w:type="dxa"/>
+              <w:right w:w="150" w:type="dxa"/>
+            </w:tcMar>
             <w:shd w:fill="F8FAFC"/>
           </w:tcPr>
           <w:p>
+            <w:pPr>
+              <w:spacing w:before="0" w:after="0" w:line="276" w:lineRule="auto"/>
+            </w:pPr>
             <w:r>
-              <w:t>**Acceso a Experto del Proceso**</w:t>
+              <w:rPr>
+                <w:rFonts w:ascii="Calibri" w:hAnsi="Calibri"/>
+                <w:b/>
+                <w:color w:val="1E293B"/>
+                <w:sz w:val="19"/>
+              </w:rPr>
+              <w:t>Acceso a Experto del Proceso</w:t>
             </w:r>
           </w:p>
         </w:tc>
         <w:tc>
           <w:tcPr>
             <w:tcW w:type="dxa" w:w="3120"/>
+            <w:vAlign w:val="center"/>
+            <w:tcMar>
+              <w:top w:w="120" w:type="dxa"/>
+              <w:bottom w:w="120" w:type="dxa"/>
+              <w:left w:w="150" w:type="dxa"/>
+              <w:right w:w="150" w:type="dxa"/>
+            </w:tcMar>
             <w:shd w:fill="F8FAFC"/>
           </w:tcPr>
           <w:p>
+            <w:pPr>
+              <w:spacing w:before="0" w:after="0" w:line="276" w:lineRule="auto"/>
+            </w:pPr>
             <w:r>
+              <w:rPr>
+                <w:rFonts w:ascii="Calibri" w:hAnsi="Calibri"/>
+                <w:color w:val="1E293B"/>
+                <w:sz w:val="19"/>
+              </w:rPr>
               <w:t>Sí</w:t>
             </w:r>
           </w:p>
@@ -975,32 +2082,81 @@
         <w:tc>
           <w:tcPr>
             <w:tcW w:type="dxa" w:w="3120"/>
+            <w:vAlign w:val="center"/>
+            <w:tcMar>
+              <w:top w:w="120" w:type="dxa"/>
+              <w:bottom w:w="120" w:type="dxa"/>
+              <w:left w:w="150" w:type="dxa"/>
+              <w:right w:w="150" w:type="dxa"/>
+            </w:tcMar>
             <w:shd w:fill="F8FAFC"/>
           </w:tcPr>
           <w:p>
+            <w:pPr>
+              <w:spacing w:before="0" w:after="0" w:line="276" w:lineRule="auto"/>
+            </w:pPr>
             <w:r>
+              <w:rPr>
+                <w:rFonts w:ascii="Calibri" w:hAnsi="Calibri"/>
+                <w:color w:val="1E293B"/>
+                <w:sz w:val="19"/>
+              </w:rPr>
               <w:t>Contacto directo y comprometido con el dueño del negocio.</w:t>
             </w:r>
           </w:p>
         </w:tc>
       </w:tr>
       <w:tr>
+        <w:trPr>
+          <w:trHeight w:val="280"/>
+        </w:trPr>
         <w:tc>
           <w:tcPr>
             <w:tcW w:type="dxa" w:w="3120"/>
+            <w:vAlign w:val="center"/>
+            <w:tcMar>
+              <w:top w:w="120" w:type="dxa"/>
+              <w:bottom w:w="120" w:type="dxa"/>
+              <w:left w:w="150" w:type="dxa"/>
+              <w:right w:w="150" w:type="dxa"/>
+            </w:tcMar>
           </w:tcPr>
           <w:p>
+            <w:pPr>
+              <w:spacing w:before="0" w:after="0" w:line="276" w:lineRule="auto"/>
+            </w:pPr>
             <w:r>
-              <w:t>**Evidencia Comprobable**</w:t>
+              <w:rPr>
+                <w:rFonts w:ascii="Calibri" w:hAnsi="Calibri"/>
+                <w:b/>
+                <w:color w:val="1E293B"/>
+                <w:sz w:val="19"/>
+              </w:rPr>
+              <w:t>Evidencia Comprobable</w:t>
             </w:r>
           </w:p>
         </w:tc>
         <w:tc>
           <w:tcPr>
             <w:tcW w:type="dxa" w:w="3120"/>
+            <w:vAlign w:val="center"/>
+            <w:tcMar>
+              <w:top w:w="120" w:type="dxa"/>
+              <w:bottom w:w="120" w:type="dxa"/>
+              <w:left w:w="150" w:type="dxa"/>
+              <w:right w:w="150" w:type="dxa"/>
+            </w:tcMar>
           </w:tcPr>
           <w:p>
+            <w:pPr>
+              <w:spacing w:before="0" w:after="0" w:line="276" w:lineRule="auto"/>
+            </w:pPr>
             <w:r>
+              <w:rPr>
+                <w:rFonts w:ascii="Calibri" w:hAnsi="Calibri"/>
+                <w:color w:val="1E293B"/>
+                <w:sz w:val="19"/>
+              </w:rPr>
               <w:t>Sí</w:t>
             </w:r>
           </w:p>
@@ -1008,33 +2164,82 @@
         <w:tc>
           <w:tcPr>
             <w:tcW w:type="dxa" w:w="3120"/>
+            <w:vAlign w:val="center"/>
+            <w:tcMar>
+              <w:top w:w="120" w:type="dxa"/>
+              <w:bottom w:w="120" w:type="dxa"/>
+              <w:left w:w="150" w:type="dxa"/>
+              <w:right w:w="150" w:type="dxa"/>
+            </w:tcMar>
           </w:tcPr>
           <w:p>
+            <w:pPr>
+              <w:spacing w:before="0" w:after="0" w:line="276" w:lineRule="auto"/>
+            </w:pPr>
             <w:r>
+              <w:rPr>
+                <w:rFonts w:ascii="Calibri" w:hAnsi="Calibri"/>
+                <w:color w:val="1E293B"/>
+                <w:sz w:val="19"/>
+              </w:rPr>
               <w:t>Registros físicos, capturas de chat y validación presencial.</w:t>
             </w:r>
           </w:p>
         </w:tc>
       </w:tr>
       <w:tr>
+        <w:trPr>
+          <w:trHeight w:val="280"/>
+        </w:trPr>
         <w:tc>
           <w:tcPr>
             <w:tcW w:type="dxa" w:w="3120"/>
+            <w:vAlign w:val="center"/>
+            <w:tcMar>
+              <w:top w:w="120" w:type="dxa"/>
+              <w:bottom w:w="120" w:type="dxa"/>
+              <w:left w:w="150" w:type="dxa"/>
+              <w:right w:w="150" w:type="dxa"/>
+            </w:tcMar>
             <w:shd w:fill="F8FAFC"/>
           </w:tcPr>
           <w:p>
+            <w:pPr>
+              <w:spacing w:before="0" w:after="0" w:line="276" w:lineRule="auto"/>
+            </w:pPr>
             <w:r>
-              <w:t>**Alcance Acotado**</w:t>
+              <w:rPr>
+                <w:rFonts w:ascii="Calibri" w:hAnsi="Calibri"/>
+                <w:b/>
+                <w:color w:val="1E293B"/>
+                <w:sz w:val="19"/>
+              </w:rPr>
+              <w:t>Alcance Acotado</w:t>
             </w:r>
           </w:p>
         </w:tc>
         <w:tc>
           <w:tcPr>
             <w:tcW w:type="dxa" w:w="3120"/>
+            <w:vAlign w:val="center"/>
+            <w:tcMar>
+              <w:top w:w="120" w:type="dxa"/>
+              <w:bottom w:w="120" w:type="dxa"/>
+              <w:left w:w="150" w:type="dxa"/>
+              <w:right w:w="150" w:type="dxa"/>
+            </w:tcMar>
             <w:shd w:fill="F8FAFC"/>
           </w:tcPr>
           <w:p>
+            <w:pPr>
+              <w:spacing w:before="0" w:after="0" w:line="276" w:lineRule="auto"/>
+            </w:pPr>
             <w:r>
+              <w:rPr>
+                <w:rFonts w:ascii="Calibri" w:hAnsi="Calibri"/>
+                <w:color w:val="1E293B"/>
+                <w:sz w:val="19"/>
+              </w:rPr>
               <w:t>Sí</w:t>
             </w:r>
           </w:p>
@@ -1042,32 +2247,81 @@
         <w:tc>
           <w:tcPr>
             <w:tcW w:type="dxa" w:w="3120"/>
+            <w:vAlign w:val="center"/>
+            <w:tcMar>
+              <w:top w:w="120" w:type="dxa"/>
+              <w:bottom w:w="120" w:type="dxa"/>
+              <w:left w:w="150" w:type="dxa"/>
+              <w:right w:w="150" w:type="dxa"/>
+            </w:tcMar>
             <w:shd w:fill="F8FAFC"/>
           </w:tcPr>
           <w:p>
+            <w:pPr>
+              <w:spacing w:before="0" w:after="0" w:line="276" w:lineRule="auto"/>
+            </w:pPr>
             <w:r>
+              <w:rPr>
+                <w:rFonts w:ascii="Calibri" w:hAnsi="Calibri"/>
+                <w:color w:val="1E293B"/>
+                <w:sz w:val="19"/>
+              </w:rPr>
               <w:t>Enfocado estrictamente en la gestión de pedidos e inventario.</w:t>
             </w:r>
           </w:p>
         </w:tc>
       </w:tr>
       <w:tr>
+        <w:trPr>
+          <w:trHeight w:val="280"/>
+        </w:trPr>
         <w:tc>
           <w:tcPr>
             <w:tcW w:type="dxa" w:w="3120"/>
+            <w:vAlign w:val="center"/>
+            <w:tcMar>
+              <w:top w:w="120" w:type="dxa"/>
+              <w:bottom w:w="120" w:type="dxa"/>
+              <w:left w:w="150" w:type="dxa"/>
+              <w:right w:w="150" w:type="dxa"/>
+            </w:tcMar>
           </w:tcPr>
           <w:p>
+            <w:pPr>
+              <w:spacing w:before="0" w:after="0" w:line="276" w:lineRule="auto"/>
+            </w:pPr>
             <w:r>
-              <w:t>**Factibilidad Técnica**</w:t>
+              <w:rPr>
+                <w:rFonts w:ascii="Calibri" w:hAnsi="Calibri"/>
+                <w:b/>
+                <w:color w:val="1E293B"/>
+                <w:sz w:val="19"/>
+              </w:rPr>
+              <w:t>Factibilidad Técnica</w:t>
             </w:r>
           </w:p>
         </w:tc>
         <w:tc>
           <w:tcPr>
             <w:tcW w:type="dxa" w:w="3120"/>
+            <w:vAlign w:val="center"/>
+            <w:tcMar>
+              <w:top w:w="120" w:type="dxa"/>
+              <w:bottom w:w="120" w:type="dxa"/>
+              <w:left w:w="150" w:type="dxa"/>
+              <w:right w:w="150" w:type="dxa"/>
+            </w:tcMar>
           </w:tcPr>
           <w:p>
+            <w:pPr>
+              <w:spacing w:before="0" w:after="0" w:line="276" w:lineRule="auto"/>
+            </w:pPr>
             <w:r>
+              <w:rPr>
+                <w:rFonts w:ascii="Calibri" w:hAnsi="Calibri"/>
+                <w:color w:val="1E293B"/>
+                <w:sz w:val="19"/>
+              </w:rPr>
               <w:t>Sí</w:t>
             </w:r>
           </w:p>
@@ -1075,33 +2329,82 @@
         <w:tc>
           <w:tcPr>
             <w:tcW w:type="dxa" w:w="3120"/>
+            <w:vAlign w:val="center"/>
+            <w:tcMar>
+              <w:top w:w="120" w:type="dxa"/>
+              <w:bottom w:w="120" w:type="dxa"/>
+              <w:left w:w="150" w:type="dxa"/>
+              <w:right w:w="150" w:type="dxa"/>
+            </w:tcMar>
           </w:tcPr>
           <w:p>
+            <w:pPr>
+              <w:spacing w:before="0" w:after="0" w:line="276" w:lineRule="auto"/>
+            </w:pPr>
             <w:r>
+              <w:rPr>
+                <w:rFonts w:ascii="Calibri" w:hAnsi="Calibri"/>
+                <w:color w:val="1E293B"/>
+                <w:sz w:val="19"/>
+              </w:rPr>
               <w:t>Pila tecnológica madura y probada (React 18, TypeScript, Vite, Tailwind CSS y Node.js).</w:t>
             </w:r>
           </w:p>
         </w:tc>
       </w:tr>
       <w:tr>
+        <w:trPr>
+          <w:trHeight w:val="280"/>
+        </w:trPr>
         <w:tc>
           <w:tcPr>
             <w:tcW w:type="dxa" w:w="3120"/>
+            <w:vAlign w:val="center"/>
+            <w:tcMar>
+              <w:top w:w="120" w:type="dxa"/>
+              <w:bottom w:w="120" w:type="dxa"/>
+              <w:left w:w="150" w:type="dxa"/>
+              <w:right w:w="150" w:type="dxa"/>
+            </w:tcMar>
             <w:shd w:fill="F8FAFC"/>
           </w:tcPr>
           <w:p>
+            <w:pPr>
+              <w:spacing w:before="0" w:after="0" w:line="276" w:lineRule="auto"/>
+            </w:pPr>
             <w:r>
-              <w:t>**Protección de Datos**</w:t>
+              <w:rPr>
+                <w:rFonts w:ascii="Calibri" w:hAnsi="Calibri"/>
+                <w:b/>
+                <w:color w:val="1E293B"/>
+                <w:sz w:val="19"/>
+              </w:rPr>
+              <w:t>Protección de Datos</w:t>
             </w:r>
           </w:p>
         </w:tc>
         <w:tc>
           <w:tcPr>
             <w:tcW w:type="dxa" w:w="3120"/>
+            <w:vAlign w:val="center"/>
+            <w:tcMar>
+              <w:top w:w="120" w:type="dxa"/>
+              <w:bottom w:w="120" w:type="dxa"/>
+              <w:left w:w="150" w:type="dxa"/>
+              <w:right w:w="150" w:type="dxa"/>
+            </w:tcMar>
             <w:shd w:fill="F8FAFC"/>
           </w:tcPr>
           <w:p>
+            <w:pPr>
+              <w:spacing w:before="0" w:after="0" w:line="276" w:lineRule="auto"/>
+            </w:pPr>
             <w:r>
+              <w:rPr>
+                <w:rFonts w:ascii="Calibri" w:hAnsi="Calibri"/>
+                <w:color w:val="1E293B"/>
+                <w:sz w:val="19"/>
+              </w:rPr>
               <w:t>Sí</w:t>
             </w:r>
           </w:p>
@@ -1109,32 +2412,81 @@
         <w:tc>
           <w:tcPr>
             <w:tcW w:type="dxa" w:w="3120"/>
+            <w:vAlign w:val="center"/>
+            <w:tcMar>
+              <w:top w:w="120" w:type="dxa"/>
+              <w:bottom w:w="120" w:type="dxa"/>
+              <w:left w:w="150" w:type="dxa"/>
+              <w:right w:w="150" w:type="dxa"/>
+            </w:tcMar>
             <w:shd w:fill="F8FAFC"/>
           </w:tcPr>
           <w:p>
+            <w:pPr>
+              <w:spacing w:before="0" w:after="0" w:line="276" w:lineRule="auto"/>
+            </w:pPr>
             <w:r>
+              <w:rPr>
+                <w:rFonts w:ascii="Calibri" w:hAnsi="Calibri"/>
+                <w:color w:val="1E293B"/>
+                <w:sz w:val="19"/>
+              </w:rPr>
               <w:t>Uso de datos sintéticos y homologación conforme a la Ley de Protección de Datos Personales.</w:t>
             </w:r>
           </w:p>
         </w:tc>
       </w:tr>
       <w:tr>
+        <w:trPr>
+          <w:trHeight w:val="280"/>
+        </w:trPr>
         <w:tc>
           <w:tcPr>
             <w:tcW w:type="dxa" w:w="3120"/>
+            <w:vAlign w:val="center"/>
+            <w:tcMar>
+              <w:top w:w="120" w:type="dxa"/>
+              <w:bottom w:w="120" w:type="dxa"/>
+              <w:left w:w="150" w:type="dxa"/>
+              <w:right w:w="150" w:type="dxa"/>
+            </w:tcMar>
           </w:tcPr>
           <w:p>
+            <w:pPr>
+              <w:spacing w:before="0" w:after="0" w:line="276" w:lineRule="auto"/>
+            </w:pPr>
             <w:r>
-              <w:t>**Despliegue Operativo**</w:t>
+              <w:rPr>
+                <w:rFonts w:ascii="Calibri" w:hAnsi="Calibri"/>
+                <w:b/>
+                <w:color w:val="1E293B"/>
+                <w:sz w:val="19"/>
+              </w:rPr>
+              <w:t>Despliegue Operativo</w:t>
             </w:r>
           </w:p>
         </w:tc>
         <w:tc>
           <w:tcPr>
             <w:tcW w:type="dxa" w:w="3120"/>
+            <w:vAlign w:val="center"/>
+            <w:tcMar>
+              <w:top w:w="120" w:type="dxa"/>
+              <w:bottom w:w="120" w:type="dxa"/>
+              <w:left w:w="150" w:type="dxa"/>
+              <w:right w:w="150" w:type="dxa"/>
+            </w:tcMar>
           </w:tcPr>
           <w:p>
+            <w:pPr>
+              <w:spacing w:before="0" w:after="0" w:line="276" w:lineRule="auto"/>
+            </w:pPr>
             <w:r>
+              <w:rPr>
+                <w:rFonts w:ascii="Calibri" w:hAnsi="Calibri"/>
+                <w:color w:val="1E293B"/>
+                <w:sz w:val="19"/>
+              </w:rPr>
               <w:t>Sí</w:t>
             </w:r>
           </w:p>
@@ -1142,19 +2494,39 @@
         <w:tc>
           <w:tcPr>
             <w:tcW w:type="dxa" w:w="3120"/>
+            <w:vAlign w:val="center"/>
+            <w:tcMar>
+              <w:top w:w="120" w:type="dxa"/>
+              <w:bottom w:w="120" w:type="dxa"/>
+              <w:left w:w="150" w:type="dxa"/>
+              <w:right w:w="150" w:type="dxa"/>
+            </w:tcMar>
           </w:tcPr>
           <w:p>
+            <w:pPr>
+              <w:spacing w:before="0" w:after="0" w:line="276" w:lineRule="auto"/>
+            </w:pPr>
             <w:r>
+              <w:rPr>
+                <w:rFonts w:ascii="Calibri" w:hAnsi="Calibri"/>
+                <w:color w:val="1E293B"/>
+                <w:sz w:val="19"/>
+              </w:rPr>
               <w:t>Despliegue automatizado en CDN Serverless (GitHub Pages / Vercel) con alta disponibilidad.</w:t>
             </w:r>
           </w:p>
         </w:tc>
       </w:tr>
     </w:tbl>
-    <w:p/>
     <w:p>
       <w:pPr>
-        <w:spacing w:before="160" w:after="40"/>
+        <w:spacing w:before="0" w:after="120"/>
+      </w:pPr>
+    </w:p>
+    <w:p>
+      <w:pPr>
+        <w:keepNext/>
+        <w:spacing w:before="200" w:after="40"/>
       </w:pPr>
       <w:r>
         <w:rPr>
@@ -1168,9 +2540,14 @@
     </w:p>
     <w:p>
       <w:pPr>
-        <w:spacing w:after="80"/>
+        <w:spacing w:before="40" w:after="80" w:line="276" w:lineRule="auto"/>
       </w:pPr>
       <w:r>
+        <w:rPr>
+          <w:rFonts w:ascii="Calibri" w:hAnsi="Calibri"/>
+          <w:color w:val="1E293B"/>
+          <w:sz w:val="22"/>
+        </w:rPr>
         <w:t>"LeoFit es un negocio peruano de indumentaria deportiva que gestiona sus ventas manualmente por WhatsApp y notas en papel, generando demoras de 25 minutos por orden y riesgos de sobreventa. Desarrollamos una Progressive Web App (PWA) de ultra-bajo peso que permite a los clientes confirmar pedidos en 2 minutos con stock en tiempo real y brinda al administrador control integral del inventario y trazabilidad de despachos con un solo clic."</w:t>
       </w:r>
     </w:p>

</xml_diff>